<commit_message>
Add Java basics PDF and update protocol and main class
Added A01_JavaBasics.pdf and a temporary file. Updated Protocol.docx and added a comment indicating no AI usage in Main.java.
</commit_message>
<xml_diff>
--- a/Modules/Semester_1/Modern Code/Aufgaben/01_Java_Basics_Pseudocode/Protocol.docx
+++ b/Modules/Semester_1/Modern Code/Aufgaben/01_Java_Basics_Pseudocode/Protocol.docx
@@ -5,7 +5,12 @@
     <w:sdt>
       <w:sdtPr>
         <w:rPr>
+          <w:rFonts w:ascii="Bahnschrift" w:eastAsiaTheme="minorHAnsi" w:hAnsi="Bahnschrift"/>
+          <w:kern w:val="2"/>
           <w:sz w:val="2"/>
+          <w:szCs w:val="24"/>
+          <w:lang w:val="en-AT"/>
+          <w14:ligatures w14:val="standardContextual"/>
         </w:rPr>
         <w:id w:val="1964927903"/>
         <w:docPartObj>
@@ -15,12 +20,7 @@
       </w:sdtPr>
       <w:sdtEndPr>
         <w:rPr>
-          <w:rFonts w:ascii="Bahnschrift" w:eastAsiaTheme="minorHAnsi" w:hAnsi="Bahnschrift"/>
-          <w:kern w:val="2"/>
           <w:sz w:val="24"/>
-          <w:szCs w:val="24"/>
-          <w:lang w:val="en-AT"/>
-          <w14:ligatures w14:val="standardContextual"/>
         </w:rPr>
       </w:sdtEndPr>
       <w:sdtContent>
@@ -300,20 +300,7 @@
                                     <w:lang w:val="en-US"/>
                                   </w:rPr>
                                   <w:tab/>
-                                </w:r>
-                                <w:proofErr w:type="gramStart"/>
-                                <w:r>
-                                  <w:rPr>
-                                    <w:lang w:val="en-US"/>
-                                  </w:rPr>
-                                  <w:t>XX:XX</w:t>
-                                </w:r>
-                                <w:proofErr w:type="gramEnd"/>
-                                <w:r>
-                                  <w:rPr>
-                                    <w:lang w:val="en-US"/>
-                                  </w:rPr>
-                                  <w:t>:XX</w:t>
+                                  <w:t>XX:XX:XX</w:t>
                                 </w:r>
                               </w:p>
                             </w:txbxContent>
@@ -457,20 +444,7 @@
                               <w:lang w:val="en-US"/>
                             </w:rPr>
                             <w:tab/>
-                          </w:r>
-                          <w:proofErr w:type="gramStart"/>
-                          <w:r>
-                            <w:rPr>
-                              <w:lang w:val="en-US"/>
-                            </w:rPr>
-                            <w:t>XX:XX</w:t>
-                          </w:r>
-                          <w:proofErr w:type="gramEnd"/>
-                          <w:r>
-                            <w:rPr>
-                              <w:lang w:val="en-US"/>
-                            </w:rPr>
-                            <w:t>:XX</w:t>
+                            <w:t>XX:XX:XX</w:t>
                           </w:r>
                         </w:p>
                       </w:txbxContent>
@@ -489,6 +463,16 @@
     </w:sdt>
     <w:sdt>
       <w:sdtPr>
+        <w:rPr>
+          <w:rFonts w:eastAsiaTheme="minorHAnsi" w:cstheme="minorBidi"/>
+          <w:b w:val="0"/>
+          <w:color w:val="auto"/>
+          <w:kern w:val="2"/>
+          <w:sz w:val="24"/>
+          <w:szCs w:val="24"/>
+          <w:lang w:val="en-AT"/>
+          <w14:ligatures w14:val="standardContextual"/>
+        </w:rPr>
         <w:id w:val="-989636350"/>
         <w:docPartObj>
           <w:docPartGallery w:val="Table of Contents"/>
@@ -497,15 +481,8 @@
       </w:sdtPr>
       <w:sdtEndPr>
         <w:rPr>
-          <w:rFonts w:eastAsiaTheme="minorHAnsi" w:cstheme="minorBidi"/>
           <w:bCs/>
           <w:noProof/>
-          <w:color w:val="auto"/>
-          <w:kern w:val="2"/>
-          <w:sz w:val="24"/>
-          <w:szCs w:val="24"/>
-          <w:lang w:val="en-AT"/>
-          <w14:ligatures w14:val="standardContextual"/>
         </w:rPr>
       </w:sdtEndPr>
       <w:sdtContent>
@@ -1417,14 +1394,27 @@
                             <w:r>
                               <w:t xml:space="preserve">Figure </w:t>
                             </w:r>
-                            <w:fldSimple w:instr=" SEQ Figure \* ARABIC ">
-                              <w:r>
-                                <w:rPr>
-                                  <w:noProof/>
-                                </w:rPr>
-                                <w:t>1</w:t>
-                              </w:r>
-                            </w:fldSimple>
+                            <w:r>
+                              <w:fldChar w:fldCharType="begin"/>
+                            </w:r>
+                            <w:r>
+                              <w:instrText xml:space="preserve"> SEQ Figure \* ARABIC </w:instrText>
+                            </w:r>
+                            <w:r>
+                              <w:fldChar w:fldCharType="separate"/>
+                            </w:r>
+                            <w:r>
+                              <w:rPr>
+                                <w:noProof/>
+                              </w:rPr>
+                              <w:t>1</w:t>
+                            </w:r>
+                            <w:r>
+                              <w:rPr>
+                                <w:noProof/>
+                              </w:rPr>
+                              <w:fldChar w:fldCharType="end"/>
+                            </w:r>
                             <w:r>
                               <w:t xml:space="preserve">: </w:t>
                             </w:r>
@@ -1466,14 +1456,27 @@
                       <w:r>
                         <w:t xml:space="preserve">Figure </w:t>
                       </w:r>
-                      <w:fldSimple w:instr=" SEQ Figure \* ARABIC ">
-                        <w:r>
-                          <w:rPr>
-                            <w:noProof/>
-                          </w:rPr>
-                          <w:t>1</w:t>
-                        </w:r>
-                      </w:fldSimple>
+                      <w:r>
+                        <w:fldChar w:fldCharType="begin"/>
+                      </w:r>
+                      <w:r>
+                        <w:instrText xml:space="preserve"> SEQ Figure \* ARABIC </w:instrText>
+                      </w:r>
+                      <w:r>
+                        <w:fldChar w:fldCharType="separate"/>
+                      </w:r>
+                      <w:r>
+                        <w:rPr>
+                          <w:noProof/>
+                        </w:rPr>
+                        <w:t>1</w:t>
+                      </w:r>
+                      <w:r>
+                        <w:rPr>
+                          <w:noProof/>
+                        </w:rPr>
+                        <w:fldChar w:fldCharType="end"/>
+                      </w:r>
                       <w:r>
                         <w:t xml:space="preserve">: </w:t>
                       </w:r>
@@ -1496,6 +1499,7 @@
       </w:r>
       <w:r>
         <w:rPr>
+          <w:noProof/>
           <w:lang w:val="fr-FR"/>
         </w:rPr>
         <w:drawing>
@@ -1522,7 +1526,7 @@
                     <pic:cNvPicPr/>
                   </pic:nvPicPr>
                   <pic:blipFill>
-                    <a:blip r:embed="rId7">
+                    <a:blip r:embed="rId8">
                       <a:extLst>
                         <a:ext uri="{28A0092B-C50C-407E-A947-70E740481C1C}">
                           <a14:useLocalDpi xmlns:a14="http://schemas.microsoft.com/office/drawing/2010/main" val="0"/>
@@ -1606,14 +1610,27 @@
                             <w:r>
                               <w:t xml:space="preserve">Figure </w:t>
                             </w:r>
-                            <w:fldSimple w:instr=" SEQ Figure \* ARABIC ">
-                              <w:r>
-                                <w:rPr>
-                                  <w:noProof/>
-                                </w:rPr>
-                                <w:t>2</w:t>
-                              </w:r>
-                            </w:fldSimple>
+                            <w:r>
+                              <w:fldChar w:fldCharType="begin"/>
+                            </w:r>
+                            <w:r>
+                              <w:instrText xml:space="preserve"> SEQ Figure \* ARABIC </w:instrText>
+                            </w:r>
+                            <w:r>
+                              <w:fldChar w:fldCharType="separate"/>
+                            </w:r>
+                            <w:r>
+                              <w:rPr>
+                                <w:noProof/>
+                              </w:rPr>
+                              <w:t>2</w:t>
+                            </w:r>
+                            <w:r>
+                              <w:rPr>
+                                <w:noProof/>
+                              </w:rPr>
+                              <w:fldChar w:fldCharType="end"/>
+                            </w:r>
                             <w:r>
                               <w:t xml:space="preserve">: </w:t>
                             </w:r>
@@ -1655,14 +1672,27 @@
                       <w:r>
                         <w:t xml:space="preserve">Figure </w:t>
                       </w:r>
-                      <w:fldSimple w:instr=" SEQ Figure \* ARABIC ">
-                        <w:r>
-                          <w:rPr>
-                            <w:noProof/>
-                          </w:rPr>
-                          <w:t>2</w:t>
-                        </w:r>
-                      </w:fldSimple>
+                      <w:r>
+                        <w:fldChar w:fldCharType="begin"/>
+                      </w:r>
+                      <w:r>
+                        <w:instrText xml:space="preserve"> SEQ Figure \* ARABIC </w:instrText>
+                      </w:r>
+                      <w:r>
+                        <w:fldChar w:fldCharType="separate"/>
+                      </w:r>
+                      <w:r>
+                        <w:rPr>
+                          <w:noProof/>
+                        </w:rPr>
+                        <w:t>2</w:t>
+                      </w:r>
+                      <w:r>
+                        <w:rPr>
+                          <w:noProof/>
+                        </w:rPr>
+                        <w:fldChar w:fldCharType="end"/>
+                      </w:r>
                       <w:r>
                         <w:t xml:space="preserve">: </w:t>
                       </w:r>
@@ -1685,6 +1715,7 @@
       </w:r>
       <w:r>
         <w:rPr>
+          <w:noProof/>
           <w:lang w:val="fr-FR"/>
         </w:rPr>
         <w:drawing>
@@ -1711,7 +1742,7 @@
                     <pic:cNvPicPr/>
                   </pic:nvPicPr>
                   <pic:blipFill>
-                    <a:blip r:embed="rId8">
+                    <a:blip r:embed="rId9">
                       <a:extLst>
                         <a:ext uri="{28A0092B-C50C-407E-A947-70E740481C1C}">
                           <a14:useLocalDpi xmlns:a14="http://schemas.microsoft.com/office/drawing/2010/main" val="0"/>
@@ -1818,14 +1849,27 @@
                             <w:r>
                               <w:t xml:space="preserve">Figure </w:t>
                             </w:r>
-                            <w:fldSimple w:instr=" SEQ Figure \* ARABIC ">
-                              <w:r>
-                                <w:rPr>
-                                  <w:noProof/>
-                                </w:rPr>
-                                <w:t>3</w:t>
-                              </w:r>
-                            </w:fldSimple>
+                            <w:r>
+                              <w:fldChar w:fldCharType="begin"/>
+                            </w:r>
+                            <w:r>
+                              <w:instrText xml:space="preserve"> SEQ Figure \* ARABIC </w:instrText>
+                            </w:r>
+                            <w:r>
+                              <w:fldChar w:fldCharType="separate"/>
+                            </w:r>
+                            <w:r>
+                              <w:rPr>
+                                <w:noProof/>
+                              </w:rPr>
+                              <w:t>3</w:t>
+                            </w:r>
+                            <w:r>
+                              <w:rPr>
+                                <w:noProof/>
+                              </w:rPr>
+                              <w:fldChar w:fldCharType="end"/>
+                            </w:r>
                             <w:r>
                               <w:t xml:space="preserve">: </w:t>
                             </w:r>
@@ -1867,14 +1911,27 @@
                       <w:r>
                         <w:t xml:space="preserve">Figure </w:t>
                       </w:r>
-                      <w:fldSimple w:instr=" SEQ Figure \* ARABIC ">
-                        <w:r>
-                          <w:rPr>
-                            <w:noProof/>
-                          </w:rPr>
-                          <w:t>3</w:t>
-                        </w:r>
-                      </w:fldSimple>
+                      <w:r>
+                        <w:fldChar w:fldCharType="begin"/>
+                      </w:r>
+                      <w:r>
+                        <w:instrText xml:space="preserve"> SEQ Figure \* ARABIC </w:instrText>
+                      </w:r>
+                      <w:r>
+                        <w:fldChar w:fldCharType="separate"/>
+                      </w:r>
+                      <w:r>
+                        <w:rPr>
+                          <w:noProof/>
+                        </w:rPr>
+                        <w:t>3</w:t>
+                      </w:r>
+                      <w:r>
+                        <w:rPr>
+                          <w:noProof/>
+                        </w:rPr>
+                        <w:fldChar w:fldCharType="end"/>
+                      </w:r>
                       <w:r>
                         <w:t xml:space="preserve">: </w:t>
                       </w:r>
@@ -1897,6 +1954,7 @@
       </w:r>
       <w:r>
         <w:rPr>
+          <w:noProof/>
           <w:lang w:val="fr-FR"/>
         </w:rPr>
         <w:drawing>
@@ -1923,7 +1981,7 @@
                     <pic:cNvPicPr/>
                   </pic:nvPicPr>
                   <pic:blipFill>
-                    <a:blip r:embed="rId9">
+                    <a:blip r:embed="rId10">
                       <a:extLst>
                         <a:ext uri="{28A0092B-C50C-407E-A947-70E740481C1C}">
                           <a14:useLocalDpi xmlns:a14="http://schemas.microsoft.com/office/drawing/2010/main" val="0"/>
@@ -2041,6 +2099,210 @@
       <w:bookmarkStart w:id="6" w:name="_Toc211254881"/>
       <w:r>
         <w:rPr>
+          <w:noProof/>
+        </w:rPr>
+        <mc:AlternateContent>
+          <mc:Choice Requires="wps">
+            <w:drawing>
+              <wp:anchor distT="0" distB="0" distL="114300" distR="114300" simplePos="0" relativeHeight="251673600" behindDoc="0" locked="0" layoutInCell="1" allowOverlap="1" wp14:anchorId="3C24647D" wp14:editId="0D980EAA">
+                <wp:simplePos x="0" y="0"/>
+                <wp:positionH relativeFrom="column">
+                  <wp:posOffset>0</wp:posOffset>
+                </wp:positionH>
+                <wp:positionV relativeFrom="paragraph">
+                  <wp:posOffset>3864610</wp:posOffset>
+                </wp:positionV>
+                <wp:extent cx="5182870" cy="635"/>
+                <wp:effectExtent l="0" t="0" r="0" b="0"/>
+                <wp:wrapTopAndBottom/>
+                <wp:docPr id="969077124" name="Text Box 1"/>
+                <wp:cNvGraphicFramePr/>
+                <a:graphic xmlns:a="http://schemas.openxmlformats.org/drawingml/2006/main">
+                  <a:graphicData uri="http://schemas.microsoft.com/office/word/2010/wordprocessingShape">
+                    <wps:wsp>
+                      <wps:cNvSpPr txBox="1"/>
+                      <wps:spPr>
+                        <a:xfrm>
+                          <a:off x="0" y="0"/>
+                          <a:ext cx="5182870" cy="635"/>
+                        </a:xfrm>
+                        <a:prstGeom prst="rect">
+                          <a:avLst/>
+                        </a:prstGeom>
+                        <a:solidFill>
+                          <a:prstClr val="white"/>
+                        </a:solidFill>
+                        <a:ln>
+                          <a:noFill/>
+                        </a:ln>
+                      </wps:spPr>
+                      <wps:txbx>
+                        <w:txbxContent>
+                          <w:p>
+                            <w:pPr>
+                              <w:pStyle w:val="Caption"/>
+                              <w:rPr>
+                                <w:b/>
+                                <w:lang w:val="fr-FR"/>
+                              </w:rPr>
+                            </w:pPr>
+                            <w:r>
+                              <w:t xml:space="preserve">Figure </w:t>
+                            </w:r>
+                            <w:r>
+                              <w:fldChar w:fldCharType="begin"/>
+                            </w:r>
+                            <w:r>
+                              <w:instrText xml:space="preserve"> SEQ Figure \* ARABIC </w:instrText>
+                            </w:r>
+                            <w:r>
+                              <w:fldChar w:fldCharType="separate"/>
+                            </w:r>
+                            <w:r>
+                              <w:rPr>
+                                <w:noProof/>
+                              </w:rPr>
+                              <w:t>4</w:t>
+                            </w:r>
+                            <w:r>
+                              <w:fldChar w:fldCharType="end"/>
+                            </w:r>
+                            <w:r>
+                              <w:t xml:space="preserve">: </w:t>
+                            </w:r>
+                            <w:proofErr w:type="spellStart"/>
+                            <w:r>
+                              <w:t>SimpleCalculator</w:t>
+                            </w:r>
+                            <w:proofErr w:type="spellEnd"/>
+                            <w:r>
+                              <w:t xml:space="preserve"> class</w:t>
+                            </w:r>
+                          </w:p>
+                        </w:txbxContent>
+                      </wps:txbx>
+                      <wps:bodyPr rot="0" spcFirstLastPara="0" vertOverflow="overflow" horzOverflow="overflow" vert="horz" wrap="square" lIns="0" tIns="0" rIns="0" bIns="0" numCol="1" spcCol="0" rtlCol="0" fromWordArt="0" anchor="t" anchorCtr="0" forceAA="0" compatLnSpc="1">
+                        <a:prstTxWarp prst="textNoShape">
+                          <a:avLst/>
+                        </a:prstTxWarp>
+                        <a:spAutoFit/>
+                      </wps:bodyPr>
+                    </wps:wsp>
+                  </a:graphicData>
+                </a:graphic>
+              </wp:anchor>
+            </w:drawing>
+          </mc:Choice>
+          <mc:Fallback>
+            <w:pict>
+              <v:shape w14:anchorId="3C24647D" id="_x0000_s1031" type="#_x0000_t202" style="position:absolute;margin-left:0;margin-top:304.3pt;width:408.1pt;height:.05pt;z-index:251673600;visibility:visible;mso-wrap-style:square;mso-wrap-distance-left:9pt;mso-wrap-distance-top:0;mso-wrap-distance-right:9pt;mso-wrap-distance-bottom:0;mso-position-horizontal:absolute;mso-position-horizontal-relative:text;mso-position-vertical:absolute;mso-position-vertical-relative:text;v-text-anchor:top" o:gfxdata="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" stroked="f">
+                <v:textbox style="mso-fit-shape-to-text:t" inset="0,0,0,0">
+                  <w:txbxContent>
+                    <w:p>
+                      <w:pPr>
+                        <w:pStyle w:val="Caption"/>
+                        <w:rPr>
+                          <w:b/>
+                          <w:lang w:val="fr-FR"/>
+                        </w:rPr>
+                      </w:pPr>
+                      <w:r>
+                        <w:t xml:space="preserve">Figure </w:t>
+                      </w:r>
+                      <w:r>
+                        <w:fldChar w:fldCharType="begin"/>
+                      </w:r>
+                      <w:r>
+                        <w:instrText xml:space="preserve"> SEQ Figure \* ARABIC </w:instrText>
+                      </w:r>
+                      <w:r>
+                        <w:fldChar w:fldCharType="separate"/>
+                      </w:r>
+                      <w:r>
+                        <w:rPr>
+                          <w:noProof/>
+                        </w:rPr>
+                        <w:t>4</w:t>
+                      </w:r>
+                      <w:r>
+                        <w:fldChar w:fldCharType="end"/>
+                      </w:r>
+                      <w:r>
+                        <w:t xml:space="preserve">: </w:t>
+                      </w:r>
+                      <w:proofErr w:type="spellStart"/>
+                      <w:r>
+                        <w:t>SimpleCalculator</w:t>
+                      </w:r>
+                      <w:proofErr w:type="spellEnd"/>
+                      <w:r>
+                        <w:t xml:space="preserve"> class</w:t>
+                      </w:r>
+                    </w:p>
+                  </w:txbxContent>
+                </v:textbox>
+                <w10:wrap type="topAndBottom"/>
+              </v:shape>
+            </w:pict>
+          </mc:Fallback>
+        </mc:AlternateContent>
+      </w:r>
+      <w:r>
+        <w:rPr>
+          <w:lang w:val="fr-FR"/>
+        </w:rPr>
+        <w:drawing>
+          <wp:anchor distT="0" distB="0" distL="114300" distR="114300" simplePos="0" relativeHeight="251671552" behindDoc="0" locked="0" layoutInCell="1" allowOverlap="1" wp14:anchorId="5A0E0DFE" wp14:editId="26115C0E">
+            <wp:simplePos x="0" y="0"/>
+            <wp:positionH relativeFrom="margin">
+              <wp:align>right</wp:align>
+            </wp:positionH>
+            <wp:positionV relativeFrom="paragraph">
+              <wp:posOffset>534670</wp:posOffset>
+            </wp:positionV>
+            <wp:extent cx="5182870" cy="3272790"/>
+            <wp:effectExtent l="0" t="0" r="0" b="3810"/>
+            <wp:wrapTopAndBottom/>
+            <wp:docPr id="517412535" name="Picture 1" descr="A screenshot of a computer program&#10;&#10;AI-generated content may be incorrect."/>
+            <wp:cNvGraphicFramePr>
+              <a:graphicFrameLocks xmlns:a="http://schemas.openxmlformats.org/drawingml/2006/main" noChangeAspect="1"/>
+            </wp:cNvGraphicFramePr>
+            <a:graphic xmlns:a="http://schemas.openxmlformats.org/drawingml/2006/main">
+              <a:graphicData uri="http://schemas.openxmlformats.org/drawingml/2006/picture">
+                <pic:pic xmlns:pic="http://schemas.openxmlformats.org/drawingml/2006/picture">
+                  <pic:nvPicPr>
+                    <pic:cNvPr id="517412535" name="Picture 1" descr="A screenshot of a computer program&#10;&#10;AI-generated content may be incorrect."/>
+                    <pic:cNvPicPr/>
+                  </pic:nvPicPr>
+                  <pic:blipFill>
+                    <a:blip r:embed="rId11">
+                      <a:extLst>
+                        <a:ext uri="{28A0092B-C50C-407E-A947-70E740481C1C}">
+                          <a14:useLocalDpi xmlns:a14="http://schemas.microsoft.com/office/drawing/2010/main" val="0"/>
+                        </a:ext>
+                      </a:extLst>
+                    </a:blip>
+                    <a:stretch>
+                      <a:fillRect/>
+                    </a:stretch>
+                  </pic:blipFill>
+                  <pic:spPr>
+                    <a:xfrm>
+                      <a:off x="0" y="0"/>
+                      <a:ext cx="5182870" cy="3272790"/>
+                    </a:xfrm>
+                    <a:prstGeom prst="rect">
+                      <a:avLst/>
+                    </a:prstGeom>
+                  </pic:spPr>
+                </pic:pic>
+              </a:graphicData>
+            </a:graphic>
+          </wp:anchor>
+        </w:drawing>
+      </w:r>
+      <w:r>
+        <w:rPr>
           <w:lang w:val="fr-FR"/>
         </w:rPr>
         <w:t>Code</w:t>
@@ -2049,6 +2311,222 @@
     </w:p>
     <w:p>
       <w:pPr>
+        <w:rPr>
+          <w:lang w:val="fr-FR"/>
+        </w:rPr>
+      </w:pPr>
+      <w:r>
+        <w:rPr>
+          <w:noProof/>
+        </w:rPr>
+        <mc:AlternateContent>
+          <mc:Choice Requires="wps">
+            <w:drawing>
+              <wp:anchor distT="0" distB="0" distL="114300" distR="114300" simplePos="0" relativeHeight="251676672" behindDoc="0" locked="0" layoutInCell="1" allowOverlap="1" wp14:anchorId="1D8E4F4B" wp14:editId="4B50CB98">
+                <wp:simplePos x="0" y="0"/>
+                <wp:positionH relativeFrom="column">
+                  <wp:posOffset>410210</wp:posOffset>
+                </wp:positionH>
+                <wp:positionV relativeFrom="paragraph">
+                  <wp:posOffset>4627245</wp:posOffset>
+                </wp:positionV>
+                <wp:extent cx="4352925" cy="635"/>
+                <wp:effectExtent l="0" t="0" r="0" b="0"/>
+                <wp:wrapTopAndBottom/>
+                <wp:docPr id="1307428724" name="Text Box 1"/>
+                <wp:cNvGraphicFramePr/>
+                <a:graphic xmlns:a="http://schemas.openxmlformats.org/drawingml/2006/main">
+                  <a:graphicData uri="http://schemas.microsoft.com/office/word/2010/wordprocessingShape">
+                    <wps:wsp>
+                      <wps:cNvSpPr txBox="1"/>
+                      <wps:spPr>
+                        <a:xfrm>
+                          <a:off x="0" y="0"/>
+                          <a:ext cx="4352925" cy="635"/>
+                        </a:xfrm>
+                        <a:prstGeom prst="rect">
+                          <a:avLst/>
+                        </a:prstGeom>
+                        <a:solidFill>
+                          <a:prstClr val="white"/>
+                        </a:solidFill>
+                        <a:ln>
+                          <a:noFill/>
+                        </a:ln>
+                      </wps:spPr>
+                      <wps:txbx>
+                        <w:txbxContent>
+                          <w:p>
+                            <w:pPr>
+                              <w:pStyle w:val="Caption"/>
+                              <w:rPr>
+                                <w:lang w:val="fr-FR"/>
+                              </w:rPr>
+                            </w:pPr>
+                            <w:r>
+                              <w:t xml:space="preserve">Figure </w:t>
+                            </w:r>
+                            <w:r>
+                              <w:fldChar w:fldCharType="begin"/>
+                            </w:r>
+                            <w:r>
+                              <w:instrText xml:space="preserve"> SEQ Figure \* ARABIC </w:instrText>
+                            </w:r>
+                            <w:r>
+                              <w:fldChar w:fldCharType="separate"/>
+                            </w:r>
+                            <w:r>
+                              <w:rPr>
+                                <w:noProof/>
+                              </w:rPr>
+                              <w:t>5</w:t>
+                            </w:r>
+                            <w:r>
+                              <w:fldChar w:fldCharType="end"/>
+                            </w:r>
+                            <w:r>
+                              <w:t xml:space="preserve">: </w:t>
+                            </w:r>
+                            <w:proofErr w:type="spellStart"/>
+                            <w:r>
+                              <w:t>SimpleCalculator</w:t>
+                            </w:r>
+                            <w:proofErr w:type="spellEnd"/>
+                            <w:r>
+                              <w:t xml:space="preserve"> Example Usage</w:t>
+                            </w:r>
+                          </w:p>
+                        </w:txbxContent>
+                      </wps:txbx>
+                      <wps:bodyPr rot="0" spcFirstLastPara="0" vertOverflow="overflow" horzOverflow="overflow" vert="horz" wrap="square" lIns="0" tIns="0" rIns="0" bIns="0" numCol="1" spcCol="0" rtlCol="0" fromWordArt="0" anchor="t" anchorCtr="0" forceAA="0" compatLnSpc="1">
+                        <a:prstTxWarp prst="textNoShape">
+                          <a:avLst/>
+                        </a:prstTxWarp>
+                        <a:spAutoFit/>
+                      </wps:bodyPr>
+                    </wps:wsp>
+                  </a:graphicData>
+                </a:graphic>
+              </wp:anchor>
+            </w:drawing>
+          </mc:Choice>
+          <mc:Fallback>
+            <w:pict>
+              <v:shape w14:anchorId="1D8E4F4B" id="_x0000_s1032" type="#_x0000_t202" style="position:absolute;left:0;text-align:left;margin-left:32.3pt;margin-top:364.35pt;width:342.75pt;height:.05pt;z-index:251676672;visibility:visible;mso-wrap-style:square;mso-wrap-distance-left:9pt;mso-wrap-distance-top:0;mso-wrap-distance-right:9pt;mso-wrap-distance-bottom:0;mso-position-horizontal:absolute;mso-position-horizontal-relative:text;mso-position-vertical:absolute;mso-position-vertical-relative:text;v-text-anchor:top" o:gfxdata="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" stroked="f">
+                <v:textbox style="mso-fit-shape-to-text:t" inset="0,0,0,0">
+                  <w:txbxContent>
+                    <w:p>
+                      <w:pPr>
+                        <w:pStyle w:val="Caption"/>
+                        <w:rPr>
+                          <w:lang w:val="fr-FR"/>
+                        </w:rPr>
+                      </w:pPr>
+                      <w:r>
+                        <w:t xml:space="preserve">Figure </w:t>
+                      </w:r>
+                      <w:r>
+                        <w:fldChar w:fldCharType="begin"/>
+                      </w:r>
+                      <w:r>
+                        <w:instrText xml:space="preserve"> SEQ Figure \* ARABIC </w:instrText>
+                      </w:r>
+                      <w:r>
+                        <w:fldChar w:fldCharType="separate"/>
+                      </w:r>
+                      <w:r>
+                        <w:rPr>
+                          <w:noProof/>
+                        </w:rPr>
+                        <w:t>5</w:t>
+                      </w:r>
+                      <w:r>
+                        <w:fldChar w:fldCharType="end"/>
+                      </w:r>
+                      <w:r>
+                        <w:t xml:space="preserve">: </w:t>
+                      </w:r>
+                      <w:proofErr w:type="spellStart"/>
+                      <w:r>
+                        <w:t>SimpleCalculator</w:t>
+                      </w:r>
+                      <w:proofErr w:type="spellEnd"/>
+                      <w:r>
+                        <w:t xml:space="preserve"> Example Usage</w:t>
+                      </w:r>
+                    </w:p>
+                  </w:txbxContent>
+                </v:textbox>
+                <w10:wrap type="topAndBottom"/>
+              </v:shape>
+            </w:pict>
+          </mc:Fallback>
+        </mc:AlternateContent>
+      </w:r>
+      <w:r>
+        <w:rPr>
+          <w:lang w:val="fr-FR"/>
+        </w:rPr>
+        <w:drawing>
+          <wp:anchor distT="0" distB="0" distL="114300" distR="114300" simplePos="0" relativeHeight="251674624" behindDoc="0" locked="0" layoutInCell="1" allowOverlap="1" wp14:anchorId="516A4843" wp14:editId="4C46C8CF">
+            <wp:simplePos x="0" y="0"/>
+            <wp:positionH relativeFrom="margin">
+              <wp:align>center</wp:align>
+            </wp:positionH>
+            <wp:positionV relativeFrom="paragraph">
+              <wp:posOffset>4017645</wp:posOffset>
+            </wp:positionV>
+            <wp:extent cx="4353533" cy="552527"/>
+            <wp:effectExtent l="0" t="0" r="9525" b="0"/>
+            <wp:wrapTopAndBottom/>
+            <wp:docPr id="408301069" name="Picture 1" descr="A black text with black letters&#10;&#10;AI-generated content may be incorrect."/>
+            <wp:cNvGraphicFramePr>
+              <a:graphicFrameLocks xmlns:a="http://schemas.openxmlformats.org/drawingml/2006/main" noChangeAspect="1"/>
+            </wp:cNvGraphicFramePr>
+            <a:graphic xmlns:a="http://schemas.openxmlformats.org/drawingml/2006/main">
+              <a:graphicData uri="http://schemas.openxmlformats.org/drawingml/2006/picture">
+                <pic:pic xmlns:pic="http://schemas.openxmlformats.org/drawingml/2006/picture">
+                  <pic:nvPicPr>
+                    <pic:cNvPr id="408301069" name="Picture 1" descr="A black text with black letters&#10;&#10;AI-generated content may be incorrect."/>
+                    <pic:cNvPicPr/>
+                  </pic:nvPicPr>
+                  <pic:blipFill>
+                    <a:blip r:embed="rId12">
+                      <a:extLst>
+                        <a:ext uri="{28A0092B-C50C-407E-A947-70E740481C1C}">
+                          <a14:useLocalDpi xmlns:a14="http://schemas.microsoft.com/office/drawing/2010/main" val="0"/>
+                        </a:ext>
+                      </a:extLst>
+                    </a:blip>
+                    <a:stretch>
+                      <a:fillRect/>
+                    </a:stretch>
+                  </pic:blipFill>
+                  <pic:spPr>
+                    <a:xfrm>
+                      <a:off x="0" y="0"/>
+                      <a:ext cx="4353533" cy="552527"/>
+                    </a:xfrm>
+                    <a:prstGeom prst="rect">
+                      <a:avLst/>
+                    </a:prstGeom>
+                  </pic:spPr>
+                </pic:pic>
+              </a:graphicData>
+            </a:graphic>
+          </wp:anchor>
+        </w:drawing>
+      </w:r>
+    </w:p>
+    <w:p>
+      <w:pPr>
+        <w:rPr>
+          <w:lang w:val="fr-FR"/>
+        </w:rPr>
+      </w:pPr>
+    </w:p>
+    <w:p>
+      <w:pPr>
         <w:pStyle w:val="Heading2"/>
         <w:rPr>
           <w:lang w:val="fr-FR"/>
@@ -2065,12 +2543,400 @@
     </w:p>
     <w:p>
       <w:pPr>
+        <w:rPr>
+          <w:lang w:val="fr-FR"/>
+        </w:rPr>
+      </w:pPr>
+      <w:r>
+        <w:rPr>
+          <w:noProof/>
+        </w:rPr>
+        <mc:AlternateContent>
+          <mc:Choice Requires="wps">
+            <w:drawing>
+              <wp:anchor distT="0" distB="0" distL="114300" distR="114300" simplePos="0" relativeHeight="251679744" behindDoc="0" locked="0" layoutInCell="1" allowOverlap="1" wp14:anchorId="590888E8" wp14:editId="78888E06">
+                <wp:simplePos x="0" y="0"/>
+                <wp:positionH relativeFrom="margin">
+                  <wp:align>center</wp:align>
+                </wp:positionH>
+                <wp:positionV relativeFrom="paragraph">
+                  <wp:posOffset>1210310</wp:posOffset>
+                </wp:positionV>
+                <wp:extent cx="2305050" cy="635"/>
+                <wp:effectExtent l="0" t="0" r="0" b="2540"/>
+                <wp:wrapTopAndBottom/>
+                <wp:docPr id="373167267" name="Text Box 1"/>
+                <wp:cNvGraphicFramePr/>
+                <a:graphic xmlns:a="http://schemas.openxmlformats.org/drawingml/2006/main">
+                  <a:graphicData uri="http://schemas.microsoft.com/office/word/2010/wordprocessingShape">
+                    <wps:wsp>
+                      <wps:cNvSpPr txBox="1"/>
+                      <wps:spPr>
+                        <a:xfrm>
+                          <a:off x="0" y="0"/>
+                          <a:ext cx="2305050" cy="635"/>
+                        </a:xfrm>
+                        <a:prstGeom prst="rect">
+                          <a:avLst/>
+                        </a:prstGeom>
+                        <a:solidFill>
+                          <a:prstClr val="white"/>
+                        </a:solidFill>
+                        <a:ln>
+                          <a:noFill/>
+                        </a:ln>
+                      </wps:spPr>
+                      <wps:txbx>
+                        <w:txbxContent>
+                          <w:p>
+                            <w:pPr>
+                              <w:pStyle w:val="Caption"/>
+                              <w:rPr>
+                                <w:lang w:val="fr-FR"/>
+                              </w:rPr>
+                            </w:pPr>
+                            <w:r>
+                              <w:t xml:space="preserve">Figure </w:t>
+                            </w:r>
+                            <w:r>
+                              <w:fldChar w:fldCharType="begin"/>
+                            </w:r>
+                            <w:r>
+                              <w:instrText xml:space="preserve"> SEQ Figure \* ARABIC </w:instrText>
+                            </w:r>
+                            <w:r>
+                              <w:fldChar w:fldCharType="separate"/>
+                            </w:r>
+                            <w:r>
+                              <w:rPr>
+                                <w:noProof/>
+                              </w:rPr>
+                              <w:t>6</w:t>
+                            </w:r>
+                            <w:r>
+                              <w:fldChar w:fldCharType="end"/>
+                            </w:r>
+                            <w:r>
+                              <w:t>: Simple Calculator Results</w:t>
+                            </w:r>
+                          </w:p>
+                        </w:txbxContent>
+                      </wps:txbx>
+                      <wps:bodyPr rot="0" spcFirstLastPara="0" vertOverflow="overflow" horzOverflow="overflow" vert="horz" wrap="square" lIns="0" tIns="0" rIns="0" bIns="0" numCol="1" spcCol="0" rtlCol="0" fromWordArt="0" anchor="t" anchorCtr="0" forceAA="0" compatLnSpc="1">
+                        <a:prstTxWarp prst="textNoShape">
+                          <a:avLst/>
+                        </a:prstTxWarp>
+                        <a:spAutoFit/>
+                      </wps:bodyPr>
+                    </wps:wsp>
+                  </a:graphicData>
+                </a:graphic>
+              </wp:anchor>
+            </w:drawing>
+          </mc:Choice>
+          <mc:Fallback>
+            <w:pict>
+              <v:shape w14:anchorId="590888E8" id="_x0000_s1033" type="#_x0000_t202" style="position:absolute;left:0;text-align:left;margin-left:0;margin-top:95.3pt;width:181.5pt;height:.05pt;z-index:251679744;visibility:visible;mso-wrap-style:square;mso-wrap-distance-left:9pt;mso-wrap-distance-top:0;mso-wrap-distance-right:9pt;mso-wrap-distance-bottom:0;mso-position-horizontal:center;mso-position-horizontal-relative:margin;mso-position-vertical:absolute;mso-position-vertical-relative:text;v-text-anchor:top" o:gfxdata="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" stroked="f">
+                <v:textbox style="mso-fit-shape-to-text:t" inset="0,0,0,0">
+                  <w:txbxContent>
+                    <w:p>
+                      <w:pPr>
+                        <w:pStyle w:val="Caption"/>
+                        <w:rPr>
+                          <w:lang w:val="fr-FR"/>
+                        </w:rPr>
+                      </w:pPr>
+                      <w:r>
+                        <w:t xml:space="preserve">Figure </w:t>
+                      </w:r>
+                      <w:r>
+                        <w:fldChar w:fldCharType="begin"/>
+                      </w:r>
+                      <w:r>
+                        <w:instrText xml:space="preserve"> SEQ Figure \* ARABIC </w:instrText>
+                      </w:r>
+                      <w:r>
+                        <w:fldChar w:fldCharType="separate"/>
+                      </w:r>
+                      <w:r>
+                        <w:rPr>
+                          <w:noProof/>
+                        </w:rPr>
+                        <w:t>6</w:t>
+                      </w:r>
+                      <w:r>
+                        <w:fldChar w:fldCharType="end"/>
+                      </w:r>
+                      <w:r>
+                        <w:t>: Simple Calculator Results</w:t>
+                      </w:r>
+                    </w:p>
+                  </w:txbxContent>
+                </v:textbox>
+                <w10:wrap type="topAndBottom" anchorx="margin"/>
+              </v:shape>
+            </w:pict>
+          </mc:Fallback>
+        </mc:AlternateContent>
+      </w:r>
+      <w:r>
+        <w:rPr>
+          <w:lang w:val="fr-FR"/>
+        </w:rPr>
+        <w:drawing>
+          <wp:anchor distT="0" distB="0" distL="114300" distR="114300" simplePos="0" relativeHeight="251678720" behindDoc="0" locked="0" layoutInCell="1" allowOverlap="1" wp14:anchorId="69380766" wp14:editId="037A6F35">
+            <wp:simplePos x="0" y="0"/>
+            <wp:positionH relativeFrom="margin">
+              <wp:posOffset>1438275</wp:posOffset>
+            </wp:positionH>
+            <wp:positionV relativeFrom="paragraph">
+              <wp:posOffset>200025</wp:posOffset>
+            </wp:positionV>
+            <wp:extent cx="2305050" cy="1085850"/>
+            <wp:effectExtent l="0" t="0" r="0" b="0"/>
+            <wp:wrapTopAndBottom/>
+            <wp:docPr id="1681064279" name="Picture 1" descr="A calculator with numbers and letters&#10;&#10;AI-generated content may be incorrect."/>
+            <wp:cNvGraphicFramePr>
+              <a:graphicFrameLocks xmlns:a="http://schemas.openxmlformats.org/drawingml/2006/main" noChangeAspect="1"/>
+            </wp:cNvGraphicFramePr>
+            <a:graphic xmlns:a="http://schemas.openxmlformats.org/drawingml/2006/main">
+              <a:graphicData uri="http://schemas.openxmlformats.org/drawingml/2006/picture">
+                <pic:pic xmlns:pic="http://schemas.openxmlformats.org/drawingml/2006/picture">
+                  <pic:nvPicPr>
+                    <pic:cNvPr id="1681064279" name="Picture 1" descr="A calculator with numbers and letters&#10;&#10;AI-generated content may be incorrect."/>
+                    <pic:cNvPicPr/>
+                  </pic:nvPicPr>
+                  <pic:blipFill>
+                    <a:blip r:embed="rId13">
+                      <a:extLst>
+                        <a:ext uri="{28A0092B-C50C-407E-A947-70E740481C1C}">
+                          <a14:useLocalDpi xmlns:a14="http://schemas.microsoft.com/office/drawing/2010/main" val="0"/>
+                        </a:ext>
+                      </a:extLst>
+                    </a:blip>
+                    <a:stretch>
+                      <a:fillRect/>
+                    </a:stretch>
+                  </pic:blipFill>
+                  <pic:spPr>
+                    <a:xfrm>
+                      <a:off x="0" y="0"/>
+                      <a:ext cx="2305050" cy="1085850"/>
+                    </a:xfrm>
+                    <a:prstGeom prst="rect">
+                      <a:avLst/>
+                    </a:prstGeom>
+                  </pic:spPr>
+                </pic:pic>
+              </a:graphicData>
+            </a:graphic>
+          </wp:anchor>
+        </w:drawing>
+      </w:r>
+    </w:p>
+    <w:p>
+      <w:pPr>
+        <w:rPr>
+          <w:lang w:val="fr-FR"/>
+        </w:rPr>
+      </w:pPr>
+    </w:p>
+    <w:p>
+      <w:pPr>
         <w:pStyle w:val="Heading1"/>
         <w:rPr>
           <w:lang w:val="fr-FR"/>
         </w:rPr>
       </w:pPr>
       <w:bookmarkStart w:id="8" w:name="_Toc211254883"/>
+      <w:r>
+        <w:rPr>
+          <w:noProof/>
+        </w:rPr>
+        <mc:AlternateContent>
+          <mc:Choice Requires="wps">
+            <w:drawing>
+              <wp:anchor distT="0" distB="0" distL="114300" distR="114300" simplePos="0" relativeHeight="251682816" behindDoc="0" locked="0" layoutInCell="1" allowOverlap="1" wp14:anchorId="58042DBF" wp14:editId="4CD649A0">
+                <wp:simplePos x="0" y="0"/>
+                <wp:positionH relativeFrom="column">
+                  <wp:posOffset>1696085</wp:posOffset>
+                </wp:positionH>
+                <wp:positionV relativeFrom="paragraph">
+                  <wp:posOffset>3298190</wp:posOffset>
+                </wp:positionV>
+                <wp:extent cx="1781175" cy="635"/>
+                <wp:effectExtent l="0" t="0" r="0" b="0"/>
+                <wp:wrapTopAndBottom/>
+                <wp:docPr id="703353934" name="Text Box 1"/>
+                <wp:cNvGraphicFramePr/>
+                <a:graphic xmlns:a="http://schemas.openxmlformats.org/drawingml/2006/main">
+                  <a:graphicData uri="http://schemas.microsoft.com/office/word/2010/wordprocessingShape">
+                    <wps:wsp>
+                      <wps:cNvSpPr txBox="1"/>
+                      <wps:spPr>
+                        <a:xfrm>
+                          <a:off x="0" y="0"/>
+                          <a:ext cx="1781175" cy="635"/>
+                        </a:xfrm>
+                        <a:prstGeom prst="rect">
+                          <a:avLst/>
+                        </a:prstGeom>
+                        <a:solidFill>
+                          <a:prstClr val="white"/>
+                        </a:solidFill>
+                        <a:ln>
+                          <a:noFill/>
+                        </a:ln>
+                      </wps:spPr>
+                      <wps:txbx>
+                        <w:txbxContent>
+                          <w:p>
+                            <w:pPr>
+                              <w:pStyle w:val="Caption"/>
+                              <w:rPr>
+                                <w:b/>
+                                <w:lang w:val="fr-FR"/>
+                              </w:rPr>
+                            </w:pPr>
+                            <w:r>
+                              <w:t xml:space="preserve">Figure </w:t>
+                            </w:r>
+                            <w:r>
+                              <w:fldChar w:fldCharType="begin"/>
+                            </w:r>
+                            <w:r>
+                              <w:instrText xml:space="preserve"> SEQ Figure \* ARABIC </w:instrText>
+                            </w:r>
+                            <w:r>
+                              <w:fldChar w:fldCharType="separate"/>
+                            </w:r>
+                            <w:r>
+                              <w:rPr>
+                                <w:noProof/>
+                              </w:rPr>
+                              <w:t>7</w:t>
+                            </w:r>
+                            <w:r>
+                              <w:fldChar w:fldCharType="end"/>
+                            </w:r>
+                            <w:r>
+                              <w:t>: Turtle Maze Reference</w:t>
+                            </w:r>
+                          </w:p>
+                        </w:txbxContent>
+                      </wps:txbx>
+                      <wps:bodyPr rot="0" spcFirstLastPara="0" vertOverflow="overflow" horzOverflow="overflow" vert="horz" wrap="square" lIns="0" tIns="0" rIns="0" bIns="0" numCol="1" spcCol="0" rtlCol="0" fromWordArt="0" anchor="t" anchorCtr="0" forceAA="0" compatLnSpc="1">
+                        <a:prstTxWarp prst="textNoShape">
+                          <a:avLst/>
+                        </a:prstTxWarp>
+                        <a:spAutoFit/>
+                      </wps:bodyPr>
+                    </wps:wsp>
+                  </a:graphicData>
+                </a:graphic>
+              </wp:anchor>
+            </w:drawing>
+          </mc:Choice>
+          <mc:Fallback>
+            <w:pict>
+              <v:shape w14:anchorId="58042DBF" id="_x0000_s1034" type="#_x0000_t202" style="position:absolute;left:0;text-align:left;margin-left:133.55pt;margin-top:259.7pt;width:140.25pt;height:.05pt;z-index:251682816;visibility:visible;mso-wrap-style:square;mso-wrap-distance-left:9pt;mso-wrap-distance-top:0;mso-wrap-distance-right:9pt;mso-wrap-distance-bottom:0;mso-position-horizontal:absolute;mso-position-horizontal-relative:text;mso-position-vertical:absolute;mso-position-vertical-relative:text;v-text-anchor:top" o:gfxdata="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" stroked="f">
+                <v:textbox style="mso-fit-shape-to-text:t" inset="0,0,0,0">
+                  <w:txbxContent>
+                    <w:p>
+                      <w:pPr>
+                        <w:pStyle w:val="Caption"/>
+                        <w:rPr>
+                          <w:b/>
+                          <w:lang w:val="fr-FR"/>
+                        </w:rPr>
+                      </w:pPr>
+                      <w:r>
+                        <w:t xml:space="preserve">Figure </w:t>
+                      </w:r>
+                      <w:r>
+                        <w:fldChar w:fldCharType="begin"/>
+                      </w:r>
+                      <w:r>
+                        <w:instrText xml:space="preserve"> SEQ Figure \* ARABIC </w:instrText>
+                      </w:r>
+                      <w:r>
+                        <w:fldChar w:fldCharType="separate"/>
+                      </w:r>
+                      <w:r>
+                        <w:rPr>
+                          <w:noProof/>
+                        </w:rPr>
+                        <w:t>7</w:t>
+                      </w:r>
+                      <w:r>
+                        <w:fldChar w:fldCharType="end"/>
+                      </w:r>
+                      <w:r>
+                        <w:t>: Turtle Maze Reference</w:t>
+                      </w:r>
+                    </w:p>
+                  </w:txbxContent>
+                </v:textbox>
+                <w10:wrap type="topAndBottom"/>
+              </v:shape>
+            </w:pict>
+          </mc:Fallback>
+        </mc:AlternateContent>
+      </w:r>
+      <w:r>
+        <w:rPr>
+          <w:lang w:val="fr-FR"/>
+        </w:rPr>
+        <w:drawing>
+          <wp:anchor distT="0" distB="0" distL="114300" distR="114300" simplePos="0" relativeHeight="251680768" behindDoc="0" locked="0" layoutInCell="1" allowOverlap="1" wp14:anchorId="434E8C81" wp14:editId="153459F0">
+            <wp:simplePos x="0" y="0"/>
+            <wp:positionH relativeFrom="margin">
+              <wp:align>center</wp:align>
+            </wp:positionH>
+            <wp:positionV relativeFrom="paragraph">
+              <wp:posOffset>907415</wp:posOffset>
+            </wp:positionV>
+            <wp:extent cx="1781424" cy="2333951"/>
+            <wp:effectExtent l="0" t="0" r="9525" b="9525"/>
+            <wp:wrapTopAndBottom/>
+            <wp:docPr id="1058754482" name="Picture 1" descr="A group of black and white symbols&#10;&#10;AI-generated content may be incorrect."/>
+            <wp:cNvGraphicFramePr>
+              <a:graphicFrameLocks xmlns:a="http://schemas.openxmlformats.org/drawingml/2006/main" noChangeAspect="1"/>
+            </wp:cNvGraphicFramePr>
+            <a:graphic xmlns:a="http://schemas.openxmlformats.org/drawingml/2006/main">
+              <a:graphicData uri="http://schemas.openxmlformats.org/drawingml/2006/picture">
+                <pic:pic xmlns:pic="http://schemas.openxmlformats.org/drawingml/2006/picture">
+                  <pic:nvPicPr>
+                    <pic:cNvPr id="1058754482" name="Picture 1" descr="A group of black and white symbols&#10;&#10;AI-generated content may be incorrect."/>
+                    <pic:cNvPicPr/>
+                  </pic:nvPicPr>
+                  <pic:blipFill>
+                    <a:blip r:embed="rId14">
+                      <a:extLst>
+                        <a:ext uri="{28A0092B-C50C-407E-A947-70E740481C1C}">
+                          <a14:useLocalDpi xmlns:a14="http://schemas.microsoft.com/office/drawing/2010/main" val="0"/>
+                        </a:ext>
+                      </a:extLst>
+                    </a:blip>
+                    <a:stretch>
+                      <a:fillRect/>
+                    </a:stretch>
+                  </pic:blipFill>
+                  <pic:spPr>
+                    <a:xfrm>
+                      <a:off x="0" y="0"/>
+                      <a:ext cx="1781424" cy="2333951"/>
+                    </a:xfrm>
+                    <a:prstGeom prst="rect">
+                      <a:avLst/>
+                    </a:prstGeom>
+                  </pic:spPr>
+                </pic:pic>
+              </a:graphicData>
+            </a:graphic>
+          </wp:anchor>
+        </w:drawing>
+      </w:r>
       <w:proofErr w:type="spellStart"/>
       <w:r>
         <w:rPr>
@@ -2083,13 +2949,7 @@
         <w:rPr>
           <w:lang w:val="fr-FR"/>
         </w:rPr>
-        <w:t xml:space="preserve"> </w:t>
-      </w:r>
-      <w:r>
-        <w:rPr>
-          <w:lang w:val="fr-FR"/>
-        </w:rPr>
-        <w:t>3</w:t>
+        <w:t xml:space="preserve"> 3</w:t>
       </w:r>
       <w:r>
         <w:rPr>
@@ -2122,14 +2982,898 @@
     </w:p>
     <w:p>
       <w:pPr>
+        <w:pStyle w:val="Heading2"/>
+        <w:rPr>
+          <w:lang w:val="fr-FR"/>
+        </w:rPr>
+      </w:pPr>
+      <w:r>
+        <w:rPr>
+          <w:lang w:val="fr-FR"/>
+        </w:rPr>
+        <w:t>Pseudocode</w:t>
+      </w:r>
+    </w:p>
+    <w:p>
+      <w:pPr>
+        <w:rPr>
+          <w:lang w:val="fr-FR"/>
+        </w:rPr>
+      </w:pPr>
+    </w:p>
+    <w:p>
+      <w:pPr>
+        <w:pStyle w:val="Pseoudocode"/>
+      </w:pPr>
+      <w:r>
+        <w:t>1</w:t>
+      </w:r>
+      <w:r>
+        <w:tab/>
+      </w:r>
+      <w:r>
+        <w:t>START</w:t>
+      </w:r>
+    </w:p>
+    <w:p>
+      <w:pPr>
+        <w:pStyle w:val="Pseoudocode"/>
+      </w:pPr>
+      <w:r>
+        <w:t>2</w:t>
+      </w:r>
+      <w:r>
+        <w:tab/>
+      </w:r>
+      <w:r>
+        <w:t>TURN RIGHT</w:t>
+      </w:r>
+    </w:p>
+    <w:p>
+      <w:pPr>
+        <w:pStyle w:val="Pseoudocode"/>
+      </w:pPr>
+      <w:r>
+        <w:t>3</w:t>
+      </w:r>
+      <w:r>
+        <w:tab/>
+      </w:r>
+      <w:r>
+        <w:t>FORWARD</w:t>
+      </w:r>
+    </w:p>
+    <w:p>
+      <w:pPr>
+        <w:pStyle w:val="Pseoudocode"/>
+      </w:pPr>
+      <w:r>
+        <w:t>4</w:t>
+      </w:r>
+      <w:r>
+        <w:tab/>
+      </w:r>
+      <w:r>
+        <w:t>FORWARD</w:t>
+      </w:r>
+    </w:p>
+    <w:p>
+      <w:pPr>
+        <w:pStyle w:val="Pseoudocode"/>
+      </w:pPr>
+      <w:r>
+        <w:t>5</w:t>
+      </w:r>
+      <w:r>
+        <w:tab/>
+      </w:r>
+      <w:r>
+        <w:t>TURN LEFT</w:t>
+      </w:r>
+    </w:p>
+    <w:p>
+      <w:pPr>
+        <w:pStyle w:val="Pseoudocode"/>
+      </w:pPr>
+      <w:r>
+        <w:t>6</w:t>
+      </w:r>
+      <w:r>
+        <w:tab/>
+      </w:r>
+      <w:r>
+        <w:t>FORWARD</w:t>
+      </w:r>
+    </w:p>
+    <w:p>
+      <w:pPr>
+        <w:pStyle w:val="Pseoudocode"/>
+      </w:pPr>
+      <w:r>
+        <w:t>7</w:t>
+      </w:r>
+      <w:r>
+        <w:tab/>
+      </w:r>
+      <w:r>
+        <w:t>FORWARD</w:t>
+      </w:r>
+    </w:p>
+    <w:p>
+      <w:pPr>
+        <w:pStyle w:val="Pseoudocode"/>
+      </w:pPr>
+      <w:r>
+        <w:t>8</w:t>
+      </w:r>
+      <w:r>
+        <w:tab/>
+      </w:r>
+      <w:r>
+        <w:t>FORWARD</w:t>
+      </w:r>
+    </w:p>
+    <w:p>
+      <w:pPr>
+        <w:pStyle w:val="Pseoudocode"/>
+      </w:pPr>
+      <w:r>
+        <w:t>9</w:t>
+      </w:r>
+      <w:r>
+        <w:tab/>
+      </w:r>
+      <w:r>
+        <w:t>FORWARD</w:t>
+      </w:r>
+    </w:p>
+    <w:p>
+      <w:pPr>
+        <w:pStyle w:val="Pseoudocode"/>
+      </w:pPr>
+      <w:r>
+        <w:t>10</w:t>
+      </w:r>
+      <w:r>
+        <w:tab/>
+      </w:r>
+      <w:r>
+        <w:t>TURN LEFT</w:t>
+      </w:r>
+    </w:p>
+    <w:p>
+      <w:pPr>
+        <w:pStyle w:val="Pseoudocode"/>
+      </w:pPr>
+      <w:r>
+        <w:t>1</w:t>
+      </w:r>
+      <w:r>
+        <w:t>1</w:t>
+      </w:r>
+      <w:r>
+        <w:tab/>
+      </w:r>
+      <w:r>
+        <w:t>FORWARD</w:t>
+      </w:r>
+    </w:p>
+    <w:p>
+      <w:pPr>
+        <w:pStyle w:val="Pseoudocode"/>
+      </w:pPr>
+      <w:r>
+        <w:t>1</w:t>
+      </w:r>
+      <w:r>
+        <w:t>2</w:t>
+      </w:r>
+      <w:r>
+        <w:tab/>
+      </w:r>
+      <w:r>
+        <w:t>FORWARD</w:t>
+      </w:r>
+    </w:p>
+    <w:p>
+      <w:pPr>
+        <w:pStyle w:val="Pseoudocode"/>
+      </w:pPr>
+      <w:r>
+        <w:t>1</w:t>
+      </w:r>
+      <w:r>
+        <w:t>3</w:t>
+      </w:r>
+      <w:r>
+        <w:tab/>
+        <w:t>TURN RIGHT</w:t>
+      </w:r>
+    </w:p>
+    <w:p>
+      <w:pPr>
+        <w:pStyle w:val="Pseoudocode"/>
+      </w:pPr>
+      <w:r>
+        <w:t>1</w:t>
+      </w:r>
+      <w:r>
+        <w:t>4</w:t>
+      </w:r>
+      <w:r>
+        <w:tab/>
+        <w:t>FORWARD</w:t>
+      </w:r>
+    </w:p>
+    <w:p>
+      <w:pPr>
+        <w:pStyle w:val="Pseoudocode"/>
+      </w:pPr>
+      <w:r>
+        <w:br w:type="page"/>
+      </w:r>
+    </w:p>
+    <w:p>
+      <w:pPr>
+        <w:pStyle w:val="Heading2"/>
+      </w:pPr>
+      <w:r>
+        <w:lastRenderedPageBreak/>
+        <w:t>Trace Table</w:t>
+      </w:r>
+    </w:p>
+    <w:tbl>
+      <w:tblPr>
+        <w:tblStyle w:val="TableGrid"/>
+        <w:tblW w:w="0" w:type="auto"/>
+        <w:tblLook w:val="04A0" w:firstRow="1" w:lastRow="0" w:firstColumn="1" w:lastColumn="0" w:noHBand="0" w:noVBand="1"/>
+      </w:tblPr>
+      <w:tblGrid>
+        <w:gridCol w:w="1630"/>
+        <w:gridCol w:w="1630"/>
+        <w:gridCol w:w="1630"/>
+        <w:gridCol w:w="1631"/>
+        <w:gridCol w:w="1631"/>
+      </w:tblGrid>
+      <w:tr>
+        <w:tc>
+          <w:tcPr>
+            <w:tcW w:w="1630" w:type="dxa"/>
+          </w:tcPr>
+          <w:p>
+            <w:r>
+              <w:t>Line</w:t>
+            </w:r>
+          </w:p>
+        </w:tc>
+        <w:tc>
+          <w:tcPr>
+            <w:tcW w:w="1630" w:type="dxa"/>
+          </w:tcPr>
+          <w:p>
+            <w:r>
+              <w:t>Statement</w:t>
+            </w:r>
+          </w:p>
+        </w:tc>
+        <w:tc>
+          <w:tcPr>
+            <w:tcW w:w="1630" w:type="dxa"/>
+          </w:tcPr>
+          <w:p>
+            <w:r>
+              <w:t>Row</w:t>
+            </w:r>
+          </w:p>
+        </w:tc>
+        <w:tc>
+          <w:tcPr>
+            <w:tcW w:w="1631" w:type="dxa"/>
+          </w:tcPr>
+          <w:p>
+            <w:r>
+              <w:t>C</w:t>
+            </w:r>
+            <w:r>
+              <w:t>o</w:t>
+            </w:r>
+            <w:r>
+              <w:t>l</w:t>
+            </w:r>
+          </w:p>
+        </w:tc>
+        <w:tc>
+          <w:tcPr>
+            <w:tcW w:w="1631" w:type="dxa"/>
+          </w:tcPr>
+          <w:p>
+            <w:r>
+              <w:t>direction</w:t>
+            </w:r>
+          </w:p>
+        </w:tc>
+      </w:tr>
+      <w:tr>
+        <w:tc>
+          <w:tcPr>
+            <w:tcW w:w="1630" w:type="dxa"/>
+          </w:tcPr>
+          <w:p>
+            <w:r>
+              <w:t>1</w:t>
+            </w:r>
+          </w:p>
+        </w:tc>
+        <w:tc>
+          <w:tcPr>
+            <w:tcW w:w="1630" w:type="dxa"/>
+          </w:tcPr>
+          <w:p>
+            <w:r>
+              <w:t>START</w:t>
+            </w:r>
+          </w:p>
+        </w:tc>
+        <w:tc>
+          <w:tcPr>
+            <w:tcW w:w="1630" w:type="dxa"/>
+          </w:tcPr>
+          <w:p>
+            <w:r>
+              <w:t>5</w:t>
+            </w:r>
+          </w:p>
+        </w:tc>
+        <w:tc>
+          <w:tcPr>
+            <w:tcW w:w="1631" w:type="dxa"/>
+          </w:tcPr>
+          <w:p>
+            <w:r>
+              <w:t>1</w:t>
+            </w:r>
+          </w:p>
+        </w:tc>
+        <w:tc>
+          <w:tcPr>
+            <w:tcW w:w="1631" w:type="dxa"/>
+          </w:tcPr>
+          <w:p>
+            <w:r>
+              <w:t>north</w:t>
+            </w:r>
+          </w:p>
+        </w:tc>
+      </w:tr>
+      <w:tr>
+        <w:tc>
+          <w:tcPr>
+            <w:tcW w:w="1630" w:type="dxa"/>
+          </w:tcPr>
+          <w:p>
+            <w:r>
+              <w:t>2</w:t>
+            </w:r>
+          </w:p>
+        </w:tc>
+        <w:tc>
+          <w:tcPr>
+            <w:tcW w:w="1630" w:type="dxa"/>
+          </w:tcPr>
+          <w:p>
+            <w:r>
+              <w:t>TURN RIGHT</w:t>
+            </w:r>
+          </w:p>
+        </w:tc>
+        <w:tc>
+          <w:tcPr>
+            <w:tcW w:w="1630" w:type="dxa"/>
+          </w:tcPr>
+          <w:p/>
+        </w:tc>
+        <w:tc>
+          <w:tcPr>
+            <w:tcW w:w="1631" w:type="dxa"/>
+          </w:tcPr>
+          <w:p/>
+        </w:tc>
+        <w:tc>
+          <w:tcPr>
+            <w:tcW w:w="1631" w:type="dxa"/>
+          </w:tcPr>
+          <w:p/>
+        </w:tc>
+      </w:tr>
+      <w:tr>
+        <w:tc>
+          <w:tcPr>
+            <w:tcW w:w="1630" w:type="dxa"/>
+          </w:tcPr>
+          <w:p>
+            <w:r>
+              <w:t>3</w:t>
+            </w:r>
+          </w:p>
+        </w:tc>
+        <w:tc>
+          <w:tcPr>
+            <w:tcW w:w="1630" w:type="dxa"/>
+          </w:tcPr>
+          <w:p>
+            <w:r>
+              <w:t>FORWARD</w:t>
+            </w:r>
+          </w:p>
+        </w:tc>
+        <w:tc>
+          <w:tcPr>
+            <w:tcW w:w="1630" w:type="dxa"/>
+          </w:tcPr>
+          <w:p/>
+        </w:tc>
+        <w:tc>
+          <w:tcPr>
+            <w:tcW w:w="1631" w:type="dxa"/>
+          </w:tcPr>
+          <w:p/>
+        </w:tc>
+        <w:tc>
+          <w:tcPr>
+            <w:tcW w:w="1631" w:type="dxa"/>
+          </w:tcPr>
+          <w:p/>
+        </w:tc>
+      </w:tr>
+      <w:tr>
+        <w:tc>
+          <w:tcPr>
+            <w:tcW w:w="1630" w:type="dxa"/>
+          </w:tcPr>
+          <w:p>
+            <w:r>
+              <w:t>4</w:t>
+            </w:r>
+          </w:p>
+        </w:tc>
+        <w:tc>
+          <w:tcPr>
+            <w:tcW w:w="1630" w:type="dxa"/>
+          </w:tcPr>
+          <w:p>
+            <w:r>
+              <w:t>FORWARD</w:t>
+            </w:r>
+          </w:p>
+        </w:tc>
+        <w:tc>
+          <w:tcPr>
+            <w:tcW w:w="1630" w:type="dxa"/>
+          </w:tcPr>
+          <w:p/>
+        </w:tc>
+        <w:tc>
+          <w:tcPr>
+            <w:tcW w:w="1631" w:type="dxa"/>
+          </w:tcPr>
+          <w:p/>
+        </w:tc>
+        <w:tc>
+          <w:tcPr>
+            <w:tcW w:w="1631" w:type="dxa"/>
+          </w:tcPr>
+          <w:p/>
+        </w:tc>
+      </w:tr>
+      <w:tr>
+        <w:tc>
+          <w:tcPr>
+            <w:tcW w:w="1630" w:type="dxa"/>
+          </w:tcPr>
+          <w:p>
+            <w:r>
+              <w:t>5</w:t>
+            </w:r>
+          </w:p>
+        </w:tc>
+        <w:tc>
+          <w:tcPr>
+            <w:tcW w:w="1630" w:type="dxa"/>
+          </w:tcPr>
+          <w:p>
+            <w:r>
+              <w:t>TURN LEFT</w:t>
+            </w:r>
+          </w:p>
+        </w:tc>
+        <w:tc>
+          <w:tcPr>
+            <w:tcW w:w="1630" w:type="dxa"/>
+          </w:tcPr>
+          <w:p/>
+        </w:tc>
+        <w:tc>
+          <w:tcPr>
+            <w:tcW w:w="1631" w:type="dxa"/>
+          </w:tcPr>
+          <w:p/>
+        </w:tc>
+        <w:tc>
+          <w:tcPr>
+            <w:tcW w:w="1631" w:type="dxa"/>
+          </w:tcPr>
+          <w:p/>
+        </w:tc>
+      </w:tr>
+      <w:tr>
+        <w:tc>
+          <w:tcPr>
+            <w:tcW w:w="1630" w:type="dxa"/>
+          </w:tcPr>
+          <w:p>
+            <w:r>
+              <w:t>6</w:t>
+            </w:r>
+          </w:p>
+        </w:tc>
+        <w:tc>
+          <w:tcPr>
+            <w:tcW w:w="1630" w:type="dxa"/>
+          </w:tcPr>
+          <w:p>
+            <w:r>
+              <w:t>FORWARD</w:t>
+            </w:r>
+          </w:p>
+        </w:tc>
+        <w:tc>
+          <w:tcPr>
+            <w:tcW w:w="1630" w:type="dxa"/>
+          </w:tcPr>
+          <w:p/>
+        </w:tc>
+        <w:tc>
+          <w:tcPr>
+            <w:tcW w:w="1631" w:type="dxa"/>
+          </w:tcPr>
+          <w:p/>
+        </w:tc>
+        <w:tc>
+          <w:tcPr>
+            <w:tcW w:w="1631" w:type="dxa"/>
+          </w:tcPr>
+          <w:p/>
+        </w:tc>
+      </w:tr>
+      <w:tr>
+        <w:tc>
+          <w:tcPr>
+            <w:tcW w:w="1630" w:type="dxa"/>
+          </w:tcPr>
+          <w:p>
+            <w:r>
+              <w:t>7</w:t>
+            </w:r>
+          </w:p>
+        </w:tc>
+        <w:tc>
+          <w:tcPr>
+            <w:tcW w:w="1630" w:type="dxa"/>
+          </w:tcPr>
+          <w:p>
+            <w:r>
+              <w:t>FORWARD</w:t>
+            </w:r>
+          </w:p>
+        </w:tc>
+        <w:tc>
+          <w:tcPr>
+            <w:tcW w:w="1630" w:type="dxa"/>
+          </w:tcPr>
+          <w:p/>
+        </w:tc>
+        <w:tc>
+          <w:tcPr>
+            <w:tcW w:w="1631" w:type="dxa"/>
+          </w:tcPr>
+          <w:p/>
+        </w:tc>
+        <w:tc>
+          <w:tcPr>
+            <w:tcW w:w="1631" w:type="dxa"/>
+          </w:tcPr>
+          <w:p/>
+        </w:tc>
+      </w:tr>
+      <w:tr>
+        <w:tc>
+          <w:tcPr>
+            <w:tcW w:w="1630" w:type="dxa"/>
+          </w:tcPr>
+          <w:p>
+            <w:r>
+              <w:t>8</w:t>
+            </w:r>
+          </w:p>
+        </w:tc>
+        <w:tc>
+          <w:tcPr>
+            <w:tcW w:w="1630" w:type="dxa"/>
+          </w:tcPr>
+          <w:p>
+            <w:r>
+              <w:t>FORWARD</w:t>
+            </w:r>
+          </w:p>
+        </w:tc>
+        <w:tc>
+          <w:tcPr>
+            <w:tcW w:w="1630" w:type="dxa"/>
+          </w:tcPr>
+          <w:p/>
+        </w:tc>
+        <w:tc>
+          <w:tcPr>
+            <w:tcW w:w="1631" w:type="dxa"/>
+          </w:tcPr>
+          <w:p/>
+        </w:tc>
+        <w:tc>
+          <w:tcPr>
+            <w:tcW w:w="1631" w:type="dxa"/>
+          </w:tcPr>
+          <w:p/>
+        </w:tc>
+      </w:tr>
+      <w:tr>
+        <w:tc>
+          <w:tcPr>
+            <w:tcW w:w="1630" w:type="dxa"/>
+          </w:tcPr>
+          <w:p>
+            <w:r>
+              <w:t>9</w:t>
+            </w:r>
+          </w:p>
+        </w:tc>
+        <w:tc>
+          <w:tcPr>
+            <w:tcW w:w="1630" w:type="dxa"/>
+          </w:tcPr>
+          <w:p>
+            <w:r>
+              <w:t>FORWARD</w:t>
+            </w:r>
+          </w:p>
+        </w:tc>
+        <w:tc>
+          <w:tcPr>
+            <w:tcW w:w="1630" w:type="dxa"/>
+          </w:tcPr>
+          <w:p/>
+        </w:tc>
+        <w:tc>
+          <w:tcPr>
+            <w:tcW w:w="1631" w:type="dxa"/>
+          </w:tcPr>
+          <w:p/>
+        </w:tc>
+        <w:tc>
+          <w:tcPr>
+            <w:tcW w:w="1631" w:type="dxa"/>
+          </w:tcPr>
+          <w:p/>
+        </w:tc>
+      </w:tr>
+      <w:tr>
+        <w:tc>
+          <w:tcPr>
+            <w:tcW w:w="1630" w:type="dxa"/>
+          </w:tcPr>
+          <w:p>
+            <w:r>
+              <w:t>10</w:t>
+            </w:r>
+          </w:p>
+        </w:tc>
+        <w:tc>
+          <w:tcPr>
+            <w:tcW w:w="1630" w:type="dxa"/>
+          </w:tcPr>
+          <w:p>
+            <w:r>
+              <w:t>TURN LEFT</w:t>
+            </w:r>
+          </w:p>
+        </w:tc>
+        <w:tc>
+          <w:tcPr>
+            <w:tcW w:w="1630" w:type="dxa"/>
+          </w:tcPr>
+          <w:p/>
+        </w:tc>
+        <w:tc>
+          <w:tcPr>
+            <w:tcW w:w="1631" w:type="dxa"/>
+          </w:tcPr>
+          <w:p/>
+        </w:tc>
+        <w:tc>
+          <w:tcPr>
+            <w:tcW w:w="1631" w:type="dxa"/>
+          </w:tcPr>
+          <w:p/>
+        </w:tc>
+      </w:tr>
+      <w:tr>
+        <w:tc>
+          <w:tcPr>
+            <w:tcW w:w="1630" w:type="dxa"/>
+          </w:tcPr>
+          <w:p>
+            <w:r>
+              <w:t>11</w:t>
+            </w:r>
+          </w:p>
+        </w:tc>
+        <w:tc>
+          <w:tcPr>
+            <w:tcW w:w="1630" w:type="dxa"/>
+          </w:tcPr>
+          <w:p>
+            <w:r>
+              <w:t>FORWARD</w:t>
+            </w:r>
+          </w:p>
+        </w:tc>
+        <w:tc>
+          <w:tcPr>
+            <w:tcW w:w="1630" w:type="dxa"/>
+          </w:tcPr>
+          <w:p/>
+        </w:tc>
+        <w:tc>
+          <w:tcPr>
+            <w:tcW w:w="1631" w:type="dxa"/>
+          </w:tcPr>
+          <w:p/>
+        </w:tc>
+        <w:tc>
+          <w:tcPr>
+            <w:tcW w:w="1631" w:type="dxa"/>
+          </w:tcPr>
+          <w:p/>
+        </w:tc>
+      </w:tr>
+      <w:tr>
+        <w:tc>
+          <w:tcPr>
+            <w:tcW w:w="1630" w:type="dxa"/>
+          </w:tcPr>
+          <w:p>
+            <w:r>
+              <w:t>12</w:t>
+            </w:r>
+          </w:p>
+        </w:tc>
+        <w:tc>
+          <w:tcPr>
+            <w:tcW w:w="1630" w:type="dxa"/>
+          </w:tcPr>
+          <w:p>
+            <w:r>
+              <w:t>FORWARD</w:t>
+            </w:r>
+          </w:p>
+        </w:tc>
+        <w:tc>
+          <w:tcPr>
+            <w:tcW w:w="1630" w:type="dxa"/>
+          </w:tcPr>
+          <w:p/>
+        </w:tc>
+        <w:tc>
+          <w:tcPr>
+            <w:tcW w:w="1631" w:type="dxa"/>
+          </w:tcPr>
+          <w:p/>
+        </w:tc>
+        <w:tc>
+          <w:tcPr>
+            <w:tcW w:w="1631" w:type="dxa"/>
+          </w:tcPr>
+          <w:p/>
+        </w:tc>
+      </w:tr>
+      <w:tr>
+        <w:tc>
+          <w:tcPr>
+            <w:tcW w:w="1630" w:type="dxa"/>
+          </w:tcPr>
+          <w:p>
+            <w:r>
+              <w:t>13</w:t>
+            </w:r>
+          </w:p>
+        </w:tc>
+        <w:tc>
+          <w:tcPr>
+            <w:tcW w:w="1630" w:type="dxa"/>
+          </w:tcPr>
+          <w:p>
+            <w:r>
+              <w:t>TURN RIGHT</w:t>
+            </w:r>
+          </w:p>
+        </w:tc>
+        <w:tc>
+          <w:tcPr>
+            <w:tcW w:w="1630" w:type="dxa"/>
+          </w:tcPr>
+          <w:p/>
+        </w:tc>
+        <w:tc>
+          <w:tcPr>
+            <w:tcW w:w="1631" w:type="dxa"/>
+          </w:tcPr>
+          <w:p/>
+        </w:tc>
+        <w:tc>
+          <w:tcPr>
+            <w:tcW w:w="1631" w:type="dxa"/>
+          </w:tcPr>
+          <w:p/>
+        </w:tc>
+      </w:tr>
+      <w:tr>
+        <w:tc>
+          <w:tcPr>
+            <w:tcW w:w="1630" w:type="dxa"/>
+          </w:tcPr>
+          <w:p>
+            <w:r>
+              <w:t>14</w:t>
+            </w:r>
+          </w:p>
+        </w:tc>
+        <w:tc>
+          <w:tcPr>
+            <w:tcW w:w="1630" w:type="dxa"/>
+          </w:tcPr>
+          <w:p>
+            <w:r>
+              <w:t>FORWARD</w:t>
+            </w:r>
+          </w:p>
+        </w:tc>
+        <w:tc>
+          <w:tcPr>
+            <w:tcW w:w="1630" w:type="dxa"/>
+          </w:tcPr>
+          <w:p/>
+        </w:tc>
+        <w:tc>
+          <w:tcPr>
+            <w:tcW w:w="1631" w:type="dxa"/>
+          </w:tcPr>
+          <w:p/>
+        </w:tc>
+        <w:tc>
+          <w:tcPr>
+            <w:tcW w:w="1631" w:type="dxa"/>
+          </w:tcPr>
+          <w:p/>
+        </w:tc>
+      </w:tr>
+    </w:tbl>
+    <w:p/>
+    <w:p>
+      <w:pPr>
         <w:pStyle w:val="Heading1"/>
       </w:pPr>
       <w:bookmarkStart w:id="9" w:name="_Toc211254884"/>
       <w:r>
-        <w:t xml:space="preserve">Exercise </w:t>
-      </w:r>
-      <w:r>
-        <w:t>4</w:t>
+        <w:t>Exercise 4</w:t>
       </w:r>
       <w:r>
         <w:t xml:space="preserve"> </w:t>
@@ -2144,13 +3888,47 @@
         <w:t xml:space="preserve"> Number Guessing</w:t>
       </w:r>
       <w:bookmarkEnd w:id="9"/>
+    </w:p>
+    <w:p>
+      <w:pPr>
+        <w:pStyle w:val="Heading2"/>
+      </w:pPr>
+      <w:r>
+        <w:t>Pseudocode</w:t>
+      </w:r>
+    </w:p>
+    <w:p/>
+    <w:p>
+      <w:pPr>
+        <w:pStyle w:val="Pseoudocode"/>
+      </w:pPr>
+      <w:r>
+        <w:t>1</w:t>
+      </w:r>
+      <w:r>
+        <w:tab/>
+      </w:r>
+      <w:r>
+        <w:t>START</w:t>
+      </w:r>
+    </w:p>
+    <w:p>
+      <w:pPr>
+        <w:pStyle w:val="Pseoudocode"/>
+      </w:pPr>
+      <w:r>
+        <w:t>2</w:t>
+      </w:r>
+      <w:r>
+        <w:tab/>
+      </w:r>
     </w:p>
     <w:p/>
     <w:p/>
-    <w:p/>
     <w:sectPr>
-      <w:headerReference w:type="default" r:id="rId10"/>
-      <w:footerReference w:type="default" r:id="rId11"/>
+      <w:headerReference w:type="default" r:id="rId15"/>
+      <w:footerReference w:type="default" r:id="rId16"/>
+      <w:headerReference w:type="first" r:id="rId17"/>
       <w:pgSz w:w="11906" w:h="16838"/>
       <w:pgMar w:top="1872" w:right="1872" w:bottom="1872" w:left="1872" w:header="706" w:footer="706" w:gutter="0"/>
       <w:pgNumType w:start="0"/>
@@ -2281,6 +4059,300 @@
     </w:pPr>
   </w:p>
 </w:hdr>
+</file>
+
+<file path=word/header2.xml><?xml version="1.0" encoding="utf-8"?>
+<w:hdr xmlns:wpc="http://schemas.microsoft.com/office/word/2010/wordprocessingCanvas" xmlns:cx="http://schemas.microsoft.com/office/drawing/2014/chartex" xmlns:cx1="http://schemas.microsoft.com/office/drawing/2015/9/8/chartex" xmlns:cx2="http://schemas.microsoft.com/office/drawing/2015/10/21/chartex" xmlns:cx3="http://schemas.microsoft.com/office/drawing/2016/5/9/chartex" xmlns:cx4="http://schemas.microsoft.com/office/drawing/2016/5/10/chartex" xmlns:cx5="http://schemas.microsoft.com/office/drawing/2016/5/11/chartex" xmlns:cx6="http://schemas.microsoft.com/office/drawing/2016/5/12/chartex" xmlns:cx7="http://schemas.microsoft.com/office/drawing/2016/5/13/chartex" xmlns:cx8="http://schemas.microsoft.com/office/drawing/2016/5/14/chartex" xmlns:mc="http://schemas.openxmlformats.org/markup-compatibility/2006" xmlns:aink="http://schemas.microsoft.com/office/drawing/2016/ink" xmlns:am3d="http://schemas.microsoft.com/office/drawing/2017/model3d" xmlns:o="urn:schemas-microsoft-com:office:office" xmlns:oel="http://schemas.microsoft.com/office/2019/extlst" xmlns:r="http://schemas.openxmlformats.org/officeDocument/2006/relationships" xmlns:m="http://schemas.openxmlformats.org/officeDocument/2006/math" xmlns:v="urn:schemas-microsoft-com:vml" xmlns:wp14="http://schemas.microsoft.com/office/word/2010/wordprocessingDrawing" xmlns:wp="http://schemas.openxmlformats.org/drawingml/2006/wordprocessingDrawing" xmlns:w10="urn:schemas-microsoft-com:office:word" xmlns:w="http://schemas.openxmlformats.org/wordprocessingml/2006/main" xmlns:w14="http://schemas.microsoft.com/office/word/2010/wordml" xmlns:w15="http://schemas.microsoft.com/office/word/2012/wordml" xmlns:w16cex="http://schemas.microsoft.com/office/word/2018/wordml/cex" xmlns:w16cid="http://schemas.microsoft.com/office/word/2016/wordml/cid" xmlns:w16="http://schemas.microsoft.com/office/word/2018/wordml" xmlns:w16du="http://schemas.microsoft.com/office/word/2023/wordml/word16du" xmlns:w16sdtdh="http://schemas.microsoft.com/office/word/2020/wordml/sdtdatahash" xmlns:w16sdtfl="http://schemas.microsoft.com/office/word/2024/wordml/sdtformatlock" xmlns:w16se="http://schemas.microsoft.com/office/word/2015/wordml/symex" xmlns:wpg="http://schemas.microsoft.com/office/word/2010/wordprocessingGroup" xmlns:wpi="http://schemas.microsoft.com/office/word/2010/wordprocessingInk" xmlns:wne="http://schemas.microsoft.com/office/word/2006/wordml" xmlns:wps="http://schemas.microsoft.com/office/word/2010/wordprocessingShape" mc:Ignorable="w14 w15 w16se w16cid w16 w16cex w16sdtdh w16sdtfl w16du wp14">
+  <w:p>
+    <w:pPr>
+      <w:pStyle w:val="Header"/>
+    </w:pPr>
+    <w:r>
+      <w:t>UE01</w:t>
+    </w:r>
+  </w:p>
+</w:hdr>
+</file>
+
+<file path=word/numbering.xml><?xml version="1.0" encoding="utf-8"?>
+<w:numbering xmlns:wpc="http://schemas.microsoft.com/office/word/2010/wordprocessingCanvas" xmlns:cx="http://schemas.microsoft.com/office/drawing/2014/chartex" xmlns:cx1="http://schemas.microsoft.com/office/drawing/2015/9/8/chartex" xmlns:cx2="http://schemas.microsoft.com/office/drawing/2015/10/21/chartex" xmlns:cx3="http://schemas.microsoft.com/office/drawing/2016/5/9/chartex" xmlns:cx4="http://schemas.microsoft.com/office/drawing/2016/5/10/chartex" xmlns:cx5="http://schemas.microsoft.com/office/drawing/2016/5/11/chartex" xmlns:cx6="http://schemas.microsoft.com/office/drawing/2016/5/12/chartex" xmlns:cx7="http://schemas.microsoft.com/office/drawing/2016/5/13/chartex" xmlns:cx8="http://schemas.microsoft.com/office/drawing/2016/5/14/chartex" xmlns:mc="http://schemas.openxmlformats.org/markup-compatibility/2006" xmlns:aink="http://schemas.microsoft.com/office/drawing/2016/ink" xmlns:am3d="http://schemas.microsoft.com/office/drawing/2017/model3d" xmlns:o="urn:schemas-microsoft-com:office:office" xmlns:oel="http://schemas.microsoft.com/office/2019/extlst" xmlns:r="http://schemas.openxmlformats.org/officeDocument/2006/relationships" xmlns:m="http://schemas.openxmlformats.org/officeDocument/2006/math" xmlns:v="urn:schemas-microsoft-com:vml" xmlns:wp14="http://schemas.microsoft.com/office/word/2010/wordprocessingDrawing" xmlns:wp="http://schemas.openxmlformats.org/drawingml/2006/wordprocessingDrawing" xmlns:w10="urn:schemas-microsoft-com:office:word" xmlns:w="http://schemas.openxmlformats.org/wordprocessingml/2006/main" xmlns:w14="http://schemas.microsoft.com/office/word/2010/wordml" xmlns:w15="http://schemas.microsoft.com/office/word/2012/wordml" xmlns:w16cex="http://schemas.microsoft.com/office/word/2018/wordml/cex" xmlns:w16cid="http://schemas.microsoft.com/office/word/2016/wordml/cid" xmlns:w16="http://schemas.microsoft.com/office/word/2018/wordml" xmlns:w16du="http://schemas.microsoft.com/office/word/2023/wordml/word16du" xmlns:w16sdtdh="http://schemas.microsoft.com/office/word/2020/wordml/sdtdatahash" xmlns:w16sdtfl="http://schemas.microsoft.com/office/word/2024/wordml/sdtformatlock" xmlns:w16se="http://schemas.microsoft.com/office/word/2015/wordml/symex" xmlns:wpg="http://schemas.microsoft.com/office/word/2010/wordprocessingGroup" xmlns:wpi="http://schemas.microsoft.com/office/word/2010/wordprocessingInk" xmlns:wne="http://schemas.microsoft.com/office/word/2006/wordml" xmlns:wps="http://schemas.microsoft.com/office/word/2010/wordprocessingShape" mc:Ignorable="w14 w15 w16se w16cid w16 w16cex w16sdtdh w16sdtfl w16du wp14">
+  <w:abstractNum w:abstractNumId="0" w15:restartNumberingAfterBreak="0">
+    <w:nsid w:val="07AC0144"/>
+    <w:multiLevelType w:val="hybridMultilevel"/>
+    <w:tmpl w:val="1DF4A306"/>
+    <w:lvl w:ilvl="0" w:tplc="785E4F42">
+      <w:start w:val="1"/>
+      <w:numFmt w:val="decimal"/>
+      <w:lvlText w:val="%1"/>
+      <w:lvlJc w:val="left"/>
+      <w:pPr>
+        <w:ind w:left="2160" w:hanging="720"/>
+      </w:pPr>
+      <w:rPr>
+        <w:rFonts w:hint="default"/>
+      </w:rPr>
+    </w:lvl>
+    <w:lvl w:ilvl="1" w:tplc="20000019">
+      <w:start w:val="1"/>
+      <w:numFmt w:val="lowerLetter"/>
+      <w:lvlText w:val="%2."/>
+      <w:lvlJc w:val="left"/>
+      <w:pPr>
+        <w:ind w:left="2520" w:hanging="360"/>
+      </w:pPr>
+    </w:lvl>
+    <w:lvl w:ilvl="2" w:tplc="2000001B" w:tentative="1">
+      <w:start w:val="1"/>
+      <w:numFmt w:val="lowerRoman"/>
+      <w:lvlText w:val="%3."/>
+      <w:lvlJc w:val="right"/>
+      <w:pPr>
+        <w:ind w:left="3240" w:hanging="180"/>
+      </w:pPr>
+    </w:lvl>
+    <w:lvl w:ilvl="3" w:tplc="2000000F" w:tentative="1">
+      <w:start w:val="1"/>
+      <w:numFmt w:val="decimal"/>
+      <w:lvlText w:val="%4."/>
+      <w:lvlJc w:val="left"/>
+      <w:pPr>
+        <w:ind w:left="3960" w:hanging="360"/>
+      </w:pPr>
+    </w:lvl>
+    <w:lvl w:ilvl="4" w:tplc="20000019" w:tentative="1">
+      <w:start w:val="1"/>
+      <w:numFmt w:val="lowerLetter"/>
+      <w:lvlText w:val="%5."/>
+      <w:lvlJc w:val="left"/>
+      <w:pPr>
+        <w:ind w:left="4680" w:hanging="360"/>
+      </w:pPr>
+    </w:lvl>
+    <w:lvl w:ilvl="5" w:tplc="2000001B" w:tentative="1">
+      <w:start w:val="1"/>
+      <w:numFmt w:val="lowerRoman"/>
+      <w:lvlText w:val="%6."/>
+      <w:lvlJc w:val="right"/>
+      <w:pPr>
+        <w:ind w:left="5400" w:hanging="180"/>
+      </w:pPr>
+    </w:lvl>
+    <w:lvl w:ilvl="6" w:tplc="2000000F" w:tentative="1">
+      <w:start w:val="1"/>
+      <w:numFmt w:val="decimal"/>
+      <w:lvlText w:val="%7."/>
+      <w:lvlJc w:val="left"/>
+      <w:pPr>
+        <w:ind w:left="6120" w:hanging="360"/>
+      </w:pPr>
+    </w:lvl>
+    <w:lvl w:ilvl="7" w:tplc="20000019" w:tentative="1">
+      <w:start w:val="1"/>
+      <w:numFmt w:val="lowerLetter"/>
+      <w:lvlText w:val="%8."/>
+      <w:lvlJc w:val="left"/>
+      <w:pPr>
+        <w:ind w:left="6840" w:hanging="360"/>
+      </w:pPr>
+    </w:lvl>
+    <w:lvl w:ilvl="8" w:tplc="2000001B" w:tentative="1">
+      <w:start w:val="1"/>
+      <w:numFmt w:val="lowerRoman"/>
+      <w:lvlText w:val="%9."/>
+      <w:lvlJc w:val="right"/>
+      <w:pPr>
+        <w:ind w:left="7560" w:hanging="180"/>
+      </w:pPr>
+    </w:lvl>
+  </w:abstractNum>
+  <w:abstractNum w:abstractNumId="1" w15:restartNumberingAfterBreak="0">
+    <w:nsid w:val="3DEE1232"/>
+    <w:multiLevelType w:val="hybridMultilevel"/>
+    <w:tmpl w:val="57F83F06"/>
+    <w:lvl w:ilvl="0" w:tplc="B75827E2">
+      <w:start w:val="12"/>
+      <w:numFmt w:val="decimal"/>
+      <w:lvlText w:val="%1"/>
+      <w:lvlJc w:val="left"/>
+      <w:pPr>
+        <w:ind w:left="1800" w:hanging="360"/>
+      </w:pPr>
+      <w:rPr>
+        <w:rFonts w:hint="default"/>
+      </w:rPr>
+    </w:lvl>
+    <w:lvl w:ilvl="1" w:tplc="20000019" w:tentative="1">
+      <w:start w:val="1"/>
+      <w:numFmt w:val="lowerLetter"/>
+      <w:lvlText w:val="%2."/>
+      <w:lvlJc w:val="left"/>
+      <w:pPr>
+        <w:ind w:left="2520" w:hanging="360"/>
+      </w:pPr>
+    </w:lvl>
+    <w:lvl w:ilvl="2" w:tplc="2000001B" w:tentative="1">
+      <w:start w:val="1"/>
+      <w:numFmt w:val="lowerRoman"/>
+      <w:lvlText w:val="%3."/>
+      <w:lvlJc w:val="right"/>
+      <w:pPr>
+        <w:ind w:left="3240" w:hanging="180"/>
+      </w:pPr>
+    </w:lvl>
+    <w:lvl w:ilvl="3" w:tplc="2000000F" w:tentative="1">
+      <w:start w:val="1"/>
+      <w:numFmt w:val="decimal"/>
+      <w:lvlText w:val="%4."/>
+      <w:lvlJc w:val="left"/>
+      <w:pPr>
+        <w:ind w:left="3960" w:hanging="360"/>
+      </w:pPr>
+    </w:lvl>
+    <w:lvl w:ilvl="4" w:tplc="20000019" w:tentative="1">
+      <w:start w:val="1"/>
+      <w:numFmt w:val="lowerLetter"/>
+      <w:lvlText w:val="%5."/>
+      <w:lvlJc w:val="left"/>
+      <w:pPr>
+        <w:ind w:left="4680" w:hanging="360"/>
+      </w:pPr>
+    </w:lvl>
+    <w:lvl w:ilvl="5" w:tplc="2000001B" w:tentative="1">
+      <w:start w:val="1"/>
+      <w:numFmt w:val="lowerRoman"/>
+      <w:lvlText w:val="%6."/>
+      <w:lvlJc w:val="right"/>
+      <w:pPr>
+        <w:ind w:left="5400" w:hanging="180"/>
+      </w:pPr>
+    </w:lvl>
+    <w:lvl w:ilvl="6" w:tplc="2000000F" w:tentative="1">
+      <w:start w:val="1"/>
+      <w:numFmt w:val="decimal"/>
+      <w:lvlText w:val="%7."/>
+      <w:lvlJc w:val="left"/>
+      <w:pPr>
+        <w:ind w:left="6120" w:hanging="360"/>
+      </w:pPr>
+    </w:lvl>
+    <w:lvl w:ilvl="7" w:tplc="20000019" w:tentative="1">
+      <w:start w:val="1"/>
+      <w:numFmt w:val="lowerLetter"/>
+      <w:lvlText w:val="%8."/>
+      <w:lvlJc w:val="left"/>
+      <w:pPr>
+        <w:ind w:left="6840" w:hanging="360"/>
+      </w:pPr>
+    </w:lvl>
+    <w:lvl w:ilvl="8" w:tplc="2000001B" w:tentative="1">
+      <w:start w:val="1"/>
+      <w:numFmt w:val="lowerRoman"/>
+      <w:lvlText w:val="%9."/>
+      <w:lvlJc w:val="right"/>
+      <w:pPr>
+        <w:ind w:left="7560" w:hanging="180"/>
+      </w:pPr>
+    </w:lvl>
+  </w:abstractNum>
+  <w:abstractNum w:abstractNumId="2" w15:restartNumberingAfterBreak="0">
+    <w:nsid w:val="515A3E0F"/>
+    <w:multiLevelType w:val="hybridMultilevel"/>
+    <w:tmpl w:val="2CEE2032"/>
+    <w:lvl w:ilvl="0" w:tplc="A2226B84">
+      <w:start w:val="1"/>
+      <w:numFmt w:val="decimal"/>
+      <w:lvlText w:val="%1"/>
+      <w:lvlJc w:val="left"/>
+      <w:pPr>
+        <w:ind w:left="720" w:hanging="360"/>
+      </w:pPr>
+      <w:rPr>
+        <w:rFonts w:hint="default"/>
+      </w:rPr>
+    </w:lvl>
+    <w:lvl w:ilvl="1" w:tplc="20000019">
+      <w:start w:val="1"/>
+      <w:numFmt w:val="lowerLetter"/>
+      <w:lvlText w:val="%2."/>
+      <w:lvlJc w:val="left"/>
+      <w:pPr>
+        <w:ind w:left="1440" w:hanging="360"/>
+      </w:pPr>
+    </w:lvl>
+    <w:lvl w:ilvl="2" w:tplc="2000001B" w:tentative="1">
+      <w:start w:val="1"/>
+      <w:numFmt w:val="lowerRoman"/>
+      <w:lvlText w:val="%3."/>
+      <w:lvlJc w:val="right"/>
+      <w:pPr>
+        <w:ind w:left="2160" w:hanging="180"/>
+      </w:pPr>
+    </w:lvl>
+    <w:lvl w:ilvl="3" w:tplc="2000000F" w:tentative="1">
+      <w:start w:val="1"/>
+      <w:numFmt w:val="decimal"/>
+      <w:lvlText w:val="%4."/>
+      <w:lvlJc w:val="left"/>
+      <w:pPr>
+        <w:ind w:left="2880" w:hanging="360"/>
+      </w:pPr>
+    </w:lvl>
+    <w:lvl w:ilvl="4" w:tplc="20000019" w:tentative="1">
+      <w:start w:val="1"/>
+      <w:numFmt w:val="lowerLetter"/>
+      <w:lvlText w:val="%5."/>
+      <w:lvlJc w:val="left"/>
+      <w:pPr>
+        <w:ind w:left="3600" w:hanging="360"/>
+      </w:pPr>
+    </w:lvl>
+    <w:lvl w:ilvl="5" w:tplc="2000001B" w:tentative="1">
+      <w:start w:val="1"/>
+      <w:numFmt w:val="lowerRoman"/>
+      <w:lvlText w:val="%6."/>
+      <w:lvlJc w:val="right"/>
+      <w:pPr>
+        <w:ind w:left="4320" w:hanging="180"/>
+      </w:pPr>
+    </w:lvl>
+    <w:lvl w:ilvl="6" w:tplc="2000000F" w:tentative="1">
+      <w:start w:val="1"/>
+      <w:numFmt w:val="decimal"/>
+      <w:lvlText w:val="%7."/>
+      <w:lvlJc w:val="left"/>
+      <w:pPr>
+        <w:ind w:left="5040" w:hanging="360"/>
+      </w:pPr>
+    </w:lvl>
+    <w:lvl w:ilvl="7" w:tplc="20000019" w:tentative="1">
+      <w:start w:val="1"/>
+      <w:numFmt w:val="lowerLetter"/>
+      <w:lvlText w:val="%8."/>
+      <w:lvlJc w:val="left"/>
+      <w:pPr>
+        <w:ind w:left="5760" w:hanging="360"/>
+      </w:pPr>
+    </w:lvl>
+    <w:lvl w:ilvl="8" w:tplc="2000001B" w:tentative="1">
+      <w:start w:val="1"/>
+      <w:numFmt w:val="lowerRoman"/>
+      <w:lvlText w:val="%9."/>
+      <w:lvlJc w:val="right"/>
+      <w:pPr>
+        <w:ind w:left="6480" w:hanging="180"/>
+      </w:pPr>
+    </w:lvl>
+  </w:abstractNum>
+  <w:num w:numId="1" w16cid:durableId="94404181">
+    <w:abstractNumId w:val="2"/>
+  </w:num>
+  <w:num w:numId="2" w16cid:durableId="316106527">
+    <w:abstractNumId w:val="1"/>
+  </w:num>
+  <w:num w:numId="3" w16cid:durableId="1032145165">
+    <w:abstractNumId w:val="0"/>
+  </w:num>
+</w:numbering>
 </file>
 
 <file path=word/styles.xml><?xml version="1.0" encoding="utf-8"?>
@@ -3374,6 +5446,52 @@
       <w:szCs w:val="18"/>
     </w:rPr>
   </w:style>
+  <w:style w:type="paragraph" w:customStyle="1" w:styleId="Pseoudocode">
+    <w:name w:val="Pseoudocode"/>
+    <w:basedOn w:val="Normal"/>
+    <w:link w:val="PseoudocodeChar"/>
+    <w:qFormat/>
+    <w:rsid w:val="00A10066"/>
+    <w:pPr>
+      <w:spacing w:before="240" w:after="240"/>
+      <w:ind w:left="1440"/>
+      <w:contextualSpacing/>
+      <w:jc w:val="left"/>
+    </w:pPr>
+    <w:rPr>
+      <w:rFonts w:ascii="Cascadia Code" w:hAnsi="Cascadia Code"/>
+      <w:lang w:val="fr-FR"/>
+    </w:rPr>
+  </w:style>
+  <w:style w:type="character" w:customStyle="1" w:styleId="PseoudocodeChar">
+    <w:name w:val="Pseoudocode Char"/>
+    <w:basedOn w:val="DefaultParagraphFont"/>
+    <w:link w:val="Pseoudocode"/>
+    <w:rsid w:val="00A10066"/>
+    <w:rPr>
+      <w:rFonts w:ascii="Cascadia Code" w:hAnsi="Cascadia Code"/>
+      <w:lang w:val="fr-FR"/>
+    </w:rPr>
+  </w:style>
+  <w:style w:type="table" w:styleId="TableGrid">
+    <w:name w:val="Table Grid"/>
+    <w:basedOn w:val="TableNormal"/>
+    <w:uiPriority w:val="39"/>
+    <w:rsid w:val="00D94FEC"/>
+    <w:pPr>
+      <w:spacing w:after="0" w:line="240" w:lineRule="auto"/>
+    </w:pPr>
+    <w:tblPr>
+      <w:tblBorders>
+        <w:top w:val="single" w:sz="4" w:space="0" w:color="auto"/>
+        <w:left w:val="single" w:sz="4" w:space="0" w:color="auto"/>
+        <w:bottom w:val="single" w:sz="4" w:space="0" w:color="auto"/>
+        <w:right w:val="single" w:sz="4" w:space="0" w:color="auto"/>
+        <w:insideH w:val="single" w:sz="4" w:space="0" w:color="auto"/>
+        <w:insideV w:val="single" w:sz="4" w:space="0" w:color="auto"/>
+      </w:tblBorders>
+    </w:tblPr>
+  </w:style>
 </w:styles>
 </file>
 

</xml_diff>

<commit_message>
Add Java basics documents and organize sprite assets
Added MC_UE01_BUNEA.pdf and updated Protocol.docx for Java basics pseudocode tasks. Moved Sprite-0002.aseprite to the Visual Aesthetics module and added its corresponding PNG export.
</commit_message>
<xml_diff>
--- a/Modules/Semester_1/Modern Code/Aufgaben/01_Java_Basics_Pseudocode/Protocol.docx
+++ b/Modules/Semester_1/Modern Code/Aufgaben/01_Java_Basics_Pseudocode/Protocol.docx
@@ -31,6 +31,9 @@
             </w:rPr>
           </w:pPr>
           <w:r>
+            <w:rPr>
+              <w:noProof/>
+            </w:rPr>
             <mc:AlternateContent>
               <mc:Choice Requires="wps">
                 <w:drawing>
@@ -132,6 +135,9 @@
             <w:jc w:val="left"/>
           </w:pPr>
           <w:r>
+            <w:rPr>
+              <w:noProof/>
+            </w:rPr>
             <mc:AlternateContent>
               <mc:Choice Requires="wps">
                 <w:drawing>
@@ -246,13 +252,20 @@
                                 <w:r>
                                   <w:tab/>
                                 </w:r>
-                                <w:proofErr w:type="gramStart"/>
                                 <w:r>
-                                  <w:t>XX:XX</w:t>
+                                  <w:t>02</w:t>
                                 </w:r>
-                                <w:proofErr w:type="gramEnd"/>
                                 <w:r>
-                                  <w:t>:XX</w:t>
+                                  <w:t>:</w:t>
+                                </w:r>
+                                <w:r>
+                                  <w:t>16</w:t>
+                                </w:r>
+                                <w:r>
+                                  <w:t>:</w:t>
+                                </w:r>
+                                <w:r>
+                                  <w:t>16</w:t>
                                 </w:r>
                               </w:p>
                             </w:txbxContent>
@@ -349,13 +362,20 @@
                           <w:r>
                             <w:tab/>
                           </w:r>
-                          <w:proofErr w:type="gramStart"/>
                           <w:r>
-                            <w:t>XX:XX</w:t>
+                            <w:t>02</w:t>
                           </w:r>
-                          <w:proofErr w:type="gramEnd"/>
                           <w:r>
-                            <w:t>:XX</w:t>
+                            <w:t>:</w:t>
+                          </w:r>
+                          <w:r>
+                            <w:t>16</w:t>
+                          </w:r>
+                          <w:r>
+                            <w:t>:</w:t>
+                          </w:r>
+                          <w:r>
+                            <w:t>16</w:t>
                           </w:r>
                         </w:p>
                       </w:txbxContent>
@@ -409,6 +429,11 @@
             <w:tabs>
               <w:tab w:val="right" w:leader="dot" w:pos="8152"/>
             </w:tabs>
+            <w:rPr>
+              <w:rFonts w:asciiTheme="minorHAnsi" w:eastAsiaTheme="minorEastAsia" w:hAnsiTheme="minorHAnsi"/>
+              <w:noProof/>
+              <w:lang w:val="en-AT" w:eastAsia="en-AT"/>
+            </w:rPr>
           </w:pPr>
           <w:r>
             <w:fldChar w:fldCharType="begin"/>
@@ -419,50 +444,58 @@
           <w:r>
             <w:fldChar w:fldCharType="separate"/>
           </w:r>
-          <w:hyperlink w:anchor="_Toc211254875" w:history="1">
+          <w:hyperlink w:anchor="_Toc211420105" w:history="1">
             <w:r>
               <w:rPr>
                 <w:rStyle w:val="Hyperlink"/>
+                <w:noProof/>
               </w:rPr>
               <w:t>Exercise 1 – Personal Information</w:t>
             </w:r>
             <w:r>
               <w:rPr>
+                <w:noProof/>
                 <w:webHidden/>
               </w:rPr>
               <w:tab/>
             </w:r>
             <w:r>
               <w:rPr>
+                <w:noProof/>
                 <w:webHidden/>
               </w:rPr>
               <w:fldChar w:fldCharType="begin"/>
             </w:r>
             <w:r>
               <w:rPr>
+                <w:noProof/>
                 <w:webHidden/>
               </w:rPr>
-              <w:instrText xml:space="preserve"> PAGEREF _Toc211254875 \h </w:instrText>
-            </w:r>
-            <w:r>
-              <w:rPr>
+              <w:instrText xml:space="preserve"> PAGEREF _Toc211420105 \h </w:instrText>
+            </w:r>
+            <w:r>
+              <w:rPr>
+                <w:noProof/>
                 <w:webHidden/>
               </w:rPr>
             </w:r>
             <w:r>
               <w:rPr>
+                <w:noProof/>
                 <w:webHidden/>
               </w:rPr>
               <w:fldChar w:fldCharType="separate"/>
             </w:r>
             <w:r>
               <w:rPr>
+                <w:noProof/>
                 <w:webHidden/>
               </w:rPr>
               <w:t>2</w:t>
             </w:r>
             <w:r>
               <w:rPr>
+                <w:noProof/>
                 <w:webHidden/>
               </w:rPr>
               <w:fldChar w:fldCharType="end"/>
@@ -475,51 +508,64 @@
             <w:tabs>
               <w:tab w:val="right" w:leader="dot" w:pos="8152"/>
             </w:tabs>
+            <w:rPr>
+              <w:rFonts w:asciiTheme="minorHAnsi" w:eastAsiaTheme="minorEastAsia" w:hAnsiTheme="minorHAnsi"/>
+              <w:noProof/>
+              <w:lang w:val="en-AT" w:eastAsia="en-AT"/>
+            </w:rPr>
           </w:pPr>
-          <w:hyperlink w:anchor="_Toc211254876" w:history="1">
+          <w:hyperlink w:anchor="_Toc211420106" w:history="1">
             <w:r>
               <w:rPr>
                 <w:rStyle w:val="Hyperlink"/>
+                <w:noProof/>
               </w:rPr>
               <w:t>Solution Idea</w:t>
             </w:r>
             <w:r>
               <w:rPr>
+                <w:noProof/>
                 <w:webHidden/>
               </w:rPr>
               <w:tab/>
             </w:r>
             <w:r>
               <w:rPr>
+                <w:noProof/>
                 <w:webHidden/>
               </w:rPr>
               <w:fldChar w:fldCharType="begin"/>
             </w:r>
             <w:r>
               <w:rPr>
+                <w:noProof/>
                 <w:webHidden/>
               </w:rPr>
-              <w:instrText xml:space="preserve"> PAGEREF _Toc211254876 \h </w:instrText>
-            </w:r>
-            <w:r>
-              <w:rPr>
+              <w:instrText xml:space="preserve"> PAGEREF _Toc211420106 \h </w:instrText>
+            </w:r>
+            <w:r>
+              <w:rPr>
+                <w:noProof/>
                 <w:webHidden/>
               </w:rPr>
             </w:r>
             <w:r>
               <w:rPr>
+                <w:noProof/>
                 <w:webHidden/>
               </w:rPr>
               <w:fldChar w:fldCharType="separate"/>
             </w:r>
             <w:r>
               <w:rPr>
+                <w:noProof/>
                 <w:webHidden/>
               </w:rPr>
               <w:t>2</w:t>
             </w:r>
             <w:r>
               <w:rPr>
+                <w:noProof/>
                 <w:webHidden/>
               </w:rPr>
               <w:fldChar w:fldCharType="end"/>
@@ -532,51 +578,64 @@
             <w:tabs>
               <w:tab w:val="right" w:leader="dot" w:pos="8152"/>
             </w:tabs>
+            <w:rPr>
+              <w:rFonts w:asciiTheme="minorHAnsi" w:eastAsiaTheme="minorEastAsia" w:hAnsiTheme="minorHAnsi"/>
+              <w:noProof/>
+              <w:lang w:val="en-AT" w:eastAsia="en-AT"/>
+            </w:rPr>
           </w:pPr>
-          <w:hyperlink w:anchor="_Toc211254877" w:history="1">
+          <w:hyperlink w:anchor="_Toc211420107" w:history="1">
             <w:r>
               <w:rPr>
                 <w:rStyle w:val="Hyperlink"/>
+                <w:noProof/>
               </w:rPr>
               <w:t>Code</w:t>
             </w:r>
             <w:r>
               <w:rPr>
+                <w:noProof/>
                 <w:webHidden/>
               </w:rPr>
               <w:tab/>
             </w:r>
             <w:r>
               <w:rPr>
+                <w:noProof/>
                 <w:webHidden/>
               </w:rPr>
               <w:fldChar w:fldCharType="begin"/>
             </w:r>
             <w:r>
               <w:rPr>
+                <w:noProof/>
                 <w:webHidden/>
               </w:rPr>
-              <w:instrText xml:space="preserve"> PAGEREF _Toc211254877 \h </w:instrText>
-            </w:r>
-            <w:r>
-              <w:rPr>
+              <w:instrText xml:space="preserve"> PAGEREF _Toc211420107 \h </w:instrText>
+            </w:r>
+            <w:r>
+              <w:rPr>
+                <w:noProof/>
                 <w:webHidden/>
               </w:rPr>
             </w:r>
             <w:r>
               <w:rPr>
+                <w:noProof/>
                 <w:webHidden/>
               </w:rPr>
               <w:fldChar w:fldCharType="separate"/>
             </w:r>
             <w:r>
               <w:rPr>
+                <w:noProof/>
                 <w:webHidden/>
               </w:rPr>
               <w:t>2</w:t>
             </w:r>
             <w:r>
               <w:rPr>
+                <w:noProof/>
                 <w:webHidden/>
               </w:rPr>
               <w:fldChar w:fldCharType="end"/>
@@ -589,51 +648,64 @@
             <w:tabs>
               <w:tab w:val="right" w:leader="dot" w:pos="8152"/>
             </w:tabs>
+            <w:rPr>
+              <w:rFonts w:asciiTheme="minorHAnsi" w:eastAsiaTheme="minorEastAsia" w:hAnsiTheme="minorHAnsi"/>
+              <w:noProof/>
+              <w:lang w:val="en-AT" w:eastAsia="en-AT"/>
+            </w:rPr>
           </w:pPr>
-          <w:hyperlink w:anchor="_Toc211254878" w:history="1">
+          <w:hyperlink w:anchor="_Toc211420108" w:history="1">
             <w:r>
               <w:rPr>
                 <w:rStyle w:val="Hyperlink"/>
+                <w:noProof/>
               </w:rPr>
               <w:t>Tests</w:t>
             </w:r>
             <w:r>
               <w:rPr>
+                <w:noProof/>
                 <w:webHidden/>
               </w:rPr>
               <w:tab/>
             </w:r>
             <w:r>
               <w:rPr>
+                <w:noProof/>
                 <w:webHidden/>
               </w:rPr>
               <w:fldChar w:fldCharType="begin"/>
             </w:r>
             <w:r>
               <w:rPr>
+                <w:noProof/>
                 <w:webHidden/>
               </w:rPr>
-              <w:instrText xml:space="preserve"> PAGEREF _Toc211254878 \h </w:instrText>
-            </w:r>
-            <w:r>
-              <w:rPr>
+              <w:instrText xml:space="preserve"> PAGEREF _Toc211420108 \h </w:instrText>
+            </w:r>
+            <w:r>
+              <w:rPr>
+                <w:noProof/>
                 <w:webHidden/>
               </w:rPr>
             </w:r>
             <w:r>
               <w:rPr>
+                <w:noProof/>
                 <w:webHidden/>
               </w:rPr>
               <w:fldChar w:fldCharType="separate"/>
             </w:r>
             <w:r>
               <w:rPr>
+                <w:noProof/>
                 <w:webHidden/>
               </w:rPr>
-              <w:t>2</w:t>
-            </w:r>
-            <w:r>
-              <w:rPr>
+              <w:t>3</w:t>
+            </w:r>
+            <w:r>
+              <w:rPr>
+                <w:noProof/>
                 <w:webHidden/>
               </w:rPr>
               <w:fldChar w:fldCharType="end"/>
@@ -646,51 +718,64 @@
             <w:tabs>
               <w:tab w:val="right" w:leader="dot" w:pos="8152"/>
             </w:tabs>
+            <w:rPr>
+              <w:rFonts w:asciiTheme="minorHAnsi" w:eastAsiaTheme="minorEastAsia" w:hAnsiTheme="minorHAnsi"/>
+              <w:noProof/>
+              <w:lang w:val="en-AT" w:eastAsia="en-AT"/>
+            </w:rPr>
           </w:pPr>
-          <w:hyperlink w:anchor="_Toc211254879" w:history="1">
+          <w:hyperlink w:anchor="_Toc211420109" w:history="1">
             <w:r>
               <w:rPr>
                 <w:rStyle w:val="Hyperlink"/>
+                <w:noProof/>
               </w:rPr>
               <w:t>Exercise 2 – Simple Calculator</w:t>
             </w:r>
             <w:r>
               <w:rPr>
+                <w:noProof/>
                 <w:webHidden/>
               </w:rPr>
               <w:tab/>
             </w:r>
             <w:r>
               <w:rPr>
+                <w:noProof/>
                 <w:webHidden/>
               </w:rPr>
               <w:fldChar w:fldCharType="begin"/>
             </w:r>
             <w:r>
               <w:rPr>
+                <w:noProof/>
                 <w:webHidden/>
               </w:rPr>
-              <w:instrText xml:space="preserve"> PAGEREF _Toc211254879 \h </w:instrText>
-            </w:r>
-            <w:r>
-              <w:rPr>
+              <w:instrText xml:space="preserve"> PAGEREF _Toc211420109 \h </w:instrText>
+            </w:r>
+            <w:r>
+              <w:rPr>
+                <w:noProof/>
                 <w:webHidden/>
               </w:rPr>
             </w:r>
             <w:r>
               <w:rPr>
+                <w:noProof/>
                 <w:webHidden/>
               </w:rPr>
               <w:fldChar w:fldCharType="separate"/>
             </w:r>
             <w:r>
               <w:rPr>
+                <w:noProof/>
                 <w:webHidden/>
               </w:rPr>
               <w:t>3</w:t>
             </w:r>
             <w:r>
               <w:rPr>
+                <w:noProof/>
                 <w:webHidden/>
               </w:rPr>
               <w:fldChar w:fldCharType="end"/>
@@ -703,51 +788,64 @@
             <w:tabs>
               <w:tab w:val="right" w:leader="dot" w:pos="8152"/>
             </w:tabs>
+            <w:rPr>
+              <w:rFonts w:asciiTheme="minorHAnsi" w:eastAsiaTheme="minorEastAsia" w:hAnsiTheme="minorHAnsi"/>
+              <w:noProof/>
+              <w:lang w:val="en-AT" w:eastAsia="en-AT"/>
+            </w:rPr>
           </w:pPr>
-          <w:hyperlink w:anchor="_Toc211254880" w:history="1">
+          <w:hyperlink w:anchor="_Toc211420110" w:history="1">
             <w:r>
               <w:rPr>
                 <w:rStyle w:val="Hyperlink"/>
+                <w:noProof/>
               </w:rPr>
               <w:t>Solution Idea</w:t>
             </w:r>
             <w:r>
               <w:rPr>
+                <w:noProof/>
                 <w:webHidden/>
               </w:rPr>
               <w:tab/>
             </w:r>
             <w:r>
               <w:rPr>
+                <w:noProof/>
                 <w:webHidden/>
               </w:rPr>
               <w:fldChar w:fldCharType="begin"/>
             </w:r>
             <w:r>
               <w:rPr>
+                <w:noProof/>
                 <w:webHidden/>
               </w:rPr>
-              <w:instrText xml:space="preserve"> PAGEREF _Toc211254880 \h </w:instrText>
-            </w:r>
-            <w:r>
-              <w:rPr>
+              <w:instrText xml:space="preserve"> PAGEREF _Toc211420110 \h </w:instrText>
+            </w:r>
+            <w:r>
+              <w:rPr>
+                <w:noProof/>
                 <w:webHidden/>
               </w:rPr>
             </w:r>
             <w:r>
               <w:rPr>
+                <w:noProof/>
                 <w:webHidden/>
               </w:rPr>
               <w:fldChar w:fldCharType="separate"/>
             </w:r>
             <w:r>
               <w:rPr>
+                <w:noProof/>
                 <w:webHidden/>
               </w:rPr>
               <w:t>3</w:t>
             </w:r>
             <w:r>
               <w:rPr>
+                <w:noProof/>
                 <w:webHidden/>
               </w:rPr>
               <w:fldChar w:fldCharType="end"/>
@@ -760,51 +858,64 @@
             <w:tabs>
               <w:tab w:val="right" w:leader="dot" w:pos="8152"/>
             </w:tabs>
+            <w:rPr>
+              <w:rFonts w:asciiTheme="minorHAnsi" w:eastAsiaTheme="minorEastAsia" w:hAnsiTheme="minorHAnsi"/>
+              <w:noProof/>
+              <w:lang w:val="en-AT" w:eastAsia="en-AT"/>
+            </w:rPr>
           </w:pPr>
-          <w:hyperlink w:anchor="_Toc211254881" w:history="1">
+          <w:hyperlink w:anchor="_Toc211420111" w:history="1">
             <w:r>
               <w:rPr>
                 <w:rStyle w:val="Hyperlink"/>
+                <w:noProof/>
               </w:rPr>
               <w:t>Code</w:t>
             </w:r>
             <w:r>
               <w:rPr>
+                <w:noProof/>
                 <w:webHidden/>
               </w:rPr>
               <w:tab/>
             </w:r>
             <w:r>
               <w:rPr>
+                <w:noProof/>
                 <w:webHidden/>
               </w:rPr>
               <w:fldChar w:fldCharType="begin"/>
             </w:r>
             <w:r>
               <w:rPr>
+                <w:noProof/>
                 <w:webHidden/>
               </w:rPr>
-              <w:instrText xml:space="preserve"> PAGEREF _Toc211254881 \h </w:instrText>
-            </w:r>
-            <w:r>
-              <w:rPr>
+              <w:instrText xml:space="preserve"> PAGEREF _Toc211420111 \h </w:instrText>
+            </w:r>
+            <w:r>
+              <w:rPr>
+                <w:noProof/>
                 <w:webHidden/>
               </w:rPr>
             </w:r>
             <w:r>
               <w:rPr>
+                <w:noProof/>
                 <w:webHidden/>
               </w:rPr>
               <w:fldChar w:fldCharType="separate"/>
             </w:r>
             <w:r>
               <w:rPr>
+                <w:noProof/>
                 <w:webHidden/>
               </w:rPr>
               <w:t>3</w:t>
             </w:r>
             <w:r>
               <w:rPr>
+                <w:noProof/>
                 <w:webHidden/>
               </w:rPr>
               <w:fldChar w:fldCharType="end"/>
@@ -817,51 +928,64 @@
             <w:tabs>
               <w:tab w:val="right" w:leader="dot" w:pos="8152"/>
             </w:tabs>
+            <w:rPr>
+              <w:rFonts w:asciiTheme="minorHAnsi" w:eastAsiaTheme="minorEastAsia" w:hAnsiTheme="minorHAnsi"/>
+              <w:noProof/>
+              <w:lang w:val="en-AT" w:eastAsia="en-AT"/>
+            </w:rPr>
           </w:pPr>
-          <w:hyperlink w:anchor="_Toc211254882" w:history="1">
+          <w:hyperlink w:anchor="_Toc211420112" w:history="1">
             <w:r>
               <w:rPr>
                 <w:rStyle w:val="Hyperlink"/>
+                <w:noProof/>
               </w:rPr>
               <w:t>Tests</w:t>
             </w:r>
             <w:r>
               <w:rPr>
+                <w:noProof/>
                 <w:webHidden/>
               </w:rPr>
               <w:tab/>
             </w:r>
             <w:r>
               <w:rPr>
+                <w:noProof/>
                 <w:webHidden/>
               </w:rPr>
               <w:fldChar w:fldCharType="begin"/>
             </w:r>
             <w:r>
               <w:rPr>
+                <w:noProof/>
                 <w:webHidden/>
               </w:rPr>
-              <w:instrText xml:space="preserve"> PAGEREF _Toc211254882 \h </w:instrText>
-            </w:r>
-            <w:r>
-              <w:rPr>
+              <w:instrText xml:space="preserve"> PAGEREF _Toc211420112 \h </w:instrText>
+            </w:r>
+            <w:r>
+              <w:rPr>
+                <w:noProof/>
                 <w:webHidden/>
               </w:rPr>
             </w:r>
             <w:r>
               <w:rPr>
+                <w:noProof/>
                 <w:webHidden/>
               </w:rPr>
               <w:fldChar w:fldCharType="separate"/>
             </w:r>
             <w:r>
               <w:rPr>
+                <w:noProof/>
                 <w:webHidden/>
               </w:rPr>
-              <w:t>3</w:t>
-            </w:r>
-            <w:r>
-              <w:rPr>
+              <w:t>4</w:t>
+            </w:r>
+            <w:r>
+              <w:rPr>
+                <w:noProof/>
                 <w:webHidden/>
               </w:rPr>
               <w:fldChar w:fldCharType="end"/>
@@ -874,51 +998,204 @@
             <w:tabs>
               <w:tab w:val="right" w:leader="dot" w:pos="8152"/>
             </w:tabs>
+            <w:rPr>
+              <w:rFonts w:asciiTheme="minorHAnsi" w:eastAsiaTheme="minorEastAsia" w:hAnsiTheme="minorHAnsi"/>
+              <w:noProof/>
+              <w:lang w:val="en-AT" w:eastAsia="en-AT"/>
+            </w:rPr>
           </w:pPr>
-          <w:hyperlink w:anchor="_Toc211254883" w:history="1">
+          <w:hyperlink w:anchor="_Toc211420113" w:history="1">
             <w:r>
               <w:rPr>
                 <w:rStyle w:val="Hyperlink"/>
+                <w:noProof/>
               </w:rPr>
               <w:t>Exercise 3 – Turtle Maze</w:t>
             </w:r>
             <w:r>
               <w:rPr>
+                <w:noProof/>
                 <w:webHidden/>
               </w:rPr>
               <w:tab/>
             </w:r>
             <w:r>
               <w:rPr>
+                <w:noProof/>
                 <w:webHidden/>
               </w:rPr>
               <w:fldChar w:fldCharType="begin"/>
             </w:r>
             <w:r>
               <w:rPr>
+                <w:noProof/>
                 <w:webHidden/>
               </w:rPr>
-              <w:instrText xml:space="preserve"> PAGEREF _Toc211254883 \h </w:instrText>
-            </w:r>
-            <w:r>
-              <w:rPr>
+              <w:instrText xml:space="preserve"> PAGEREF _Toc211420113 \h </w:instrText>
+            </w:r>
+            <w:r>
+              <w:rPr>
+                <w:noProof/>
                 <w:webHidden/>
               </w:rPr>
             </w:r>
             <w:r>
               <w:rPr>
+                <w:noProof/>
                 <w:webHidden/>
               </w:rPr>
               <w:fldChar w:fldCharType="separate"/>
             </w:r>
             <w:r>
               <w:rPr>
+                <w:noProof/>
                 <w:webHidden/>
               </w:rPr>
-              <w:t>3</w:t>
-            </w:r>
-            <w:r>
-              <w:rPr>
+              <w:t>4</w:t>
+            </w:r>
+            <w:r>
+              <w:rPr>
+                <w:noProof/>
+                <w:webHidden/>
+              </w:rPr>
+              <w:fldChar w:fldCharType="end"/>
+            </w:r>
+          </w:hyperlink>
+        </w:p>
+        <w:p>
+          <w:pPr>
+            <w:pStyle w:val="TOC2"/>
+            <w:tabs>
+              <w:tab w:val="right" w:leader="dot" w:pos="8152"/>
+            </w:tabs>
+            <w:rPr>
+              <w:rFonts w:asciiTheme="minorHAnsi" w:eastAsiaTheme="minorEastAsia" w:hAnsiTheme="minorHAnsi"/>
+              <w:noProof/>
+              <w:lang w:val="en-AT" w:eastAsia="en-AT"/>
+            </w:rPr>
+          </w:pPr>
+          <w:hyperlink w:anchor="_Toc211420114" w:history="1">
+            <w:r>
+              <w:rPr>
+                <w:rStyle w:val="Hyperlink"/>
+                <w:noProof/>
+              </w:rPr>
+              <w:t>Pseudocode</w:t>
+            </w:r>
+            <w:r>
+              <w:rPr>
+                <w:noProof/>
+                <w:webHidden/>
+              </w:rPr>
+              <w:tab/>
+            </w:r>
+            <w:r>
+              <w:rPr>
+                <w:noProof/>
+                <w:webHidden/>
+              </w:rPr>
+              <w:fldChar w:fldCharType="begin"/>
+            </w:r>
+            <w:r>
+              <w:rPr>
+                <w:noProof/>
+                <w:webHidden/>
+              </w:rPr>
+              <w:instrText xml:space="preserve"> PAGEREF _Toc211420114 \h </w:instrText>
+            </w:r>
+            <w:r>
+              <w:rPr>
+                <w:noProof/>
+                <w:webHidden/>
+              </w:rPr>
+            </w:r>
+            <w:r>
+              <w:rPr>
+                <w:noProof/>
+                <w:webHidden/>
+              </w:rPr>
+              <w:fldChar w:fldCharType="separate"/>
+            </w:r>
+            <w:r>
+              <w:rPr>
+                <w:noProof/>
+                <w:webHidden/>
+              </w:rPr>
+              <w:t>4</w:t>
+            </w:r>
+            <w:r>
+              <w:rPr>
+                <w:noProof/>
+                <w:webHidden/>
+              </w:rPr>
+              <w:fldChar w:fldCharType="end"/>
+            </w:r>
+          </w:hyperlink>
+        </w:p>
+        <w:p>
+          <w:pPr>
+            <w:pStyle w:val="TOC2"/>
+            <w:tabs>
+              <w:tab w:val="right" w:leader="dot" w:pos="8152"/>
+            </w:tabs>
+            <w:rPr>
+              <w:rFonts w:asciiTheme="minorHAnsi" w:eastAsiaTheme="minorEastAsia" w:hAnsiTheme="minorHAnsi"/>
+              <w:noProof/>
+              <w:lang w:val="en-AT" w:eastAsia="en-AT"/>
+            </w:rPr>
+          </w:pPr>
+          <w:hyperlink w:anchor="_Toc211420115" w:history="1">
+            <w:r>
+              <w:rPr>
+                <w:rStyle w:val="Hyperlink"/>
+                <w:noProof/>
+              </w:rPr>
+              <w:t>Trace Table</w:t>
+            </w:r>
+            <w:r>
+              <w:rPr>
+                <w:noProof/>
+                <w:webHidden/>
+              </w:rPr>
+              <w:tab/>
+            </w:r>
+            <w:r>
+              <w:rPr>
+                <w:noProof/>
+                <w:webHidden/>
+              </w:rPr>
+              <w:fldChar w:fldCharType="begin"/>
+            </w:r>
+            <w:r>
+              <w:rPr>
+                <w:noProof/>
+                <w:webHidden/>
+              </w:rPr>
+              <w:instrText xml:space="preserve"> PAGEREF _Toc211420115 \h </w:instrText>
+            </w:r>
+            <w:r>
+              <w:rPr>
+                <w:noProof/>
+                <w:webHidden/>
+              </w:rPr>
+            </w:r>
+            <w:r>
+              <w:rPr>
+                <w:noProof/>
+                <w:webHidden/>
+              </w:rPr>
+              <w:fldChar w:fldCharType="separate"/>
+            </w:r>
+            <w:r>
+              <w:rPr>
+                <w:noProof/>
+                <w:webHidden/>
+              </w:rPr>
+              <w:t>6</w:t>
+            </w:r>
+            <w:r>
+              <w:rPr>
+                <w:noProof/>
                 <w:webHidden/>
               </w:rPr>
               <w:fldChar w:fldCharType="end"/>
@@ -931,51 +1208,204 @@
             <w:tabs>
               <w:tab w:val="right" w:leader="dot" w:pos="8152"/>
             </w:tabs>
+            <w:rPr>
+              <w:rFonts w:asciiTheme="minorHAnsi" w:eastAsiaTheme="minorEastAsia" w:hAnsiTheme="minorHAnsi"/>
+              <w:noProof/>
+              <w:lang w:val="en-AT" w:eastAsia="en-AT"/>
+            </w:rPr>
           </w:pPr>
-          <w:hyperlink w:anchor="_Toc211254884" w:history="1">
+          <w:hyperlink w:anchor="_Toc211420116" w:history="1">
             <w:r>
               <w:rPr>
                 <w:rStyle w:val="Hyperlink"/>
+                <w:noProof/>
               </w:rPr>
               <w:t>Exercise 4 – Number Guessing</w:t>
             </w:r>
             <w:r>
               <w:rPr>
+                <w:noProof/>
                 <w:webHidden/>
               </w:rPr>
               <w:tab/>
             </w:r>
             <w:r>
               <w:rPr>
+                <w:noProof/>
                 <w:webHidden/>
               </w:rPr>
               <w:fldChar w:fldCharType="begin"/>
             </w:r>
             <w:r>
               <w:rPr>
+                <w:noProof/>
                 <w:webHidden/>
               </w:rPr>
-              <w:instrText xml:space="preserve"> PAGEREF _Toc211254884 \h </w:instrText>
-            </w:r>
-            <w:r>
-              <w:rPr>
+              <w:instrText xml:space="preserve"> PAGEREF _Toc211420116 \h </w:instrText>
+            </w:r>
+            <w:r>
+              <w:rPr>
+                <w:noProof/>
                 <w:webHidden/>
               </w:rPr>
             </w:r>
             <w:r>
               <w:rPr>
+                <w:noProof/>
                 <w:webHidden/>
               </w:rPr>
               <w:fldChar w:fldCharType="separate"/>
             </w:r>
             <w:r>
               <w:rPr>
+                <w:noProof/>
                 <w:webHidden/>
               </w:rPr>
-              <w:t>3</w:t>
-            </w:r>
-            <w:r>
-              <w:rPr>
+              <w:t>7</w:t>
+            </w:r>
+            <w:r>
+              <w:rPr>
+                <w:noProof/>
+                <w:webHidden/>
+              </w:rPr>
+              <w:fldChar w:fldCharType="end"/>
+            </w:r>
+          </w:hyperlink>
+        </w:p>
+        <w:p>
+          <w:pPr>
+            <w:pStyle w:val="TOC2"/>
+            <w:tabs>
+              <w:tab w:val="right" w:leader="dot" w:pos="8152"/>
+            </w:tabs>
+            <w:rPr>
+              <w:rFonts w:asciiTheme="minorHAnsi" w:eastAsiaTheme="minorEastAsia" w:hAnsiTheme="minorHAnsi"/>
+              <w:noProof/>
+              <w:lang w:val="en-AT" w:eastAsia="en-AT"/>
+            </w:rPr>
+          </w:pPr>
+          <w:hyperlink w:anchor="_Toc211420117" w:history="1">
+            <w:r>
+              <w:rPr>
+                <w:rStyle w:val="Hyperlink"/>
+                <w:noProof/>
+              </w:rPr>
+              <w:t>Pseudocode</w:t>
+            </w:r>
+            <w:r>
+              <w:rPr>
+                <w:noProof/>
+                <w:webHidden/>
+              </w:rPr>
+              <w:tab/>
+            </w:r>
+            <w:r>
+              <w:rPr>
+                <w:noProof/>
+                <w:webHidden/>
+              </w:rPr>
+              <w:fldChar w:fldCharType="begin"/>
+            </w:r>
+            <w:r>
+              <w:rPr>
+                <w:noProof/>
+                <w:webHidden/>
+              </w:rPr>
+              <w:instrText xml:space="preserve"> PAGEREF _Toc211420117 \h </w:instrText>
+            </w:r>
+            <w:r>
+              <w:rPr>
+                <w:noProof/>
+                <w:webHidden/>
+              </w:rPr>
+            </w:r>
+            <w:r>
+              <w:rPr>
+                <w:noProof/>
+                <w:webHidden/>
+              </w:rPr>
+              <w:fldChar w:fldCharType="separate"/>
+            </w:r>
+            <w:r>
+              <w:rPr>
+                <w:noProof/>
+                <w:webHidden/>
+              </w:rPr>
+              <w:t>7</w:t>
+            </w:r>
+            <w:r>
+              <w:rPr>
+                <w:noProof/>
+                <w:webHidden/>
+              </w:rPr>
+              <w:fldChar w:fldCharType="end"/>
+            </w:r>
+          </w:hyperlink>
+        </w:p>
+        <w:p>
+          <w:pPr>
+            <w:pStyle w:val="TOC2"/>
+            <w:tabs>
+              <w:tab w:val="right" w:leader="dot" w:pos="8152"/>
+            </w:tabs>
+            <w:rPr>
+              <w:rFonts w:asciiTheme="minorHAnsi" w:eastAsiaTheme="minorEastAsia" w:hAnsiTheme="minorHAnsi"/>
+              <w:noProof/>
+              <w:lang w:val="en-AT" w:eastAsia="en-AT"/>
+            </w:rPr>
+          </w:pPr>
+          <w:hyperlink w:anchor="_Toc211420118" w:history="1">
+            <w:r>
+              <w:rPr>
+                <w:rStyle w:val="Hyperlink"/>
+                <w:noProof/>
+              </w:rPr>
+              <w:t>Trace Table</w:t>
+            </w:r>
+            <w:r>
+              <w:rPr>
+                <w:noProof/>
+                <w:webHidden/>
+              </w:rPr>
+              <w:tab/>
+            </w:r>
+            <w:r>
+              <w:rPr>
+                <w:noProof/>
+                <w:webHidden/>
+              </w:rPr>
+              <w:fldChar w:fldCharType="begin"/>
+            </w:r>
+            <w:r>
+              <w:rPr>
+                <w:noProof/>
+                <w:webHidden/>
+              </w:rPr>
+              <w:instrText xml:space="preserve"> PAGEREF _Toc211420118 \h </w:instrText>
+            </w:r>
+            <w:r>
+              <w:rPr>
+                <w:noProof/>
+                <w:webHidden/>
+              </w:rPr>
+            </w:r>
+            <w:r>
+              <w:rPr>
+                <w:noProof/>
+                <w:webHidden/>
+              </w:rPr>
+              <w:fldChar w:fldCharType="separate"/>
+            </w:r>
+            <w:r>
+              <w:rPr>
+                <w:noProof/>
+                <w:webHidden/>
+              </w:rPr>
+              <w:t>8</w:t>
+            </w:r>
+            <w:r>
+              <w:rPr>
+                <w:noProof/>
                 <w:webHidden/>
               </w:rPr>
               <w:fldChar w:fldCharType="end"/>
@@ -1005,7 +1435,7 @@
       <w:pPr>
         <w:pStyle w:val="Heading1"/>
       </w:pPr>
-      <w:bookmarkStart w:id="0" w:name="_Toc211254875"/>
+      <w:bookmarkStart w:id="0" w:name="_Toc211420105"/>
       <w:r>
         <w:lastRenderedPageBreak/>
         <w:t>Exercise 1</w:t>
@@ -1019,7 +1449,7 @@
       <w:pPr>
         <w:pStyle w:val="Heading2"/>
       </w:pPr>
-      <w:bookmarkStart w:id="1" w:name="_Toc211254876"/>
+      <w:bookmarkStart w:id="1" w:name="_Toc211420106"/>
       <w:r>
         <w:t>Solution Idea</w:t>
       </w:r>
@@ -1028,13 +1458,55 @@
     <w:p>
       <w:r>
         <w:t xml:space="preserve">The task is to </w:t>
+      </w:r>
+      <w:r>
+        <w:t xml:space="preserve">print my name, age, and student identification. </w:t>
+      </w:r>
+      <w:r>
+        <w:t xml:space="preserve">There are two simple steps to complete. </w:t>
+      </w:r>
+      <w:r>
+        <w:t xml:space="preserve">First, declare variables for each. For the name, </w:t>
+      </w:r>
+      <w:r>
+        <w:rPr>
+          <w:b/>
+          <w:bCs/>
+        </w:rPr>
+        <w:t>String</w:t>
+      </w:r>
+      <w:r>
+        <w:t xml:space="preserve"> is the ideal data type. For age, </w:t>
+      </w:r>
+      <w:r>
+        <w:rPr>
+          <w:b/>
+          <w:bCs/>
+        </w:rPr>
+        <w:t>int</w:t>
+      </w:r>
+      <w:r>
+        <w:t xml:space="preserve"> suffices. Even though the student identification is a number, the </w:t>
+      </w:r>
+      <w:r>
+        <w:rPr>
+          <w:b/>
+          <w:bCs/>
+        </w:rPr>
+        <w:t>String</w:t>
+      </w:r>
+      <w:r>
+        <w:t xml:space="preserve"> datatype is used. </w:t>
+      </w:r>
+      <w:r>
+        <w:t>Since the student identification number is not intended for mathematical operations and may include leading zeros, it should be treated as a string rather than a numeric value.</w:t>
       </w:r>
     </w:p>
     <w:p>
       <w:pPr>
         <w:pStyle w:val="Heading2"/>
       </w:pPr>
-      <w:bookmarkStart w:id="2" w:name="_Toc211254877"/>
+      <w:bookmarkStart w:id="2" w:name="_Toc211420107"/>
       <w:r>
         <w:t>Code</w:t>
       </w:r>
@@ -1042,6 +1514,9 @@
     </w:p>
     <w:p>
       <w:r>
+        <w:rPr>
+          <w:noProof/>
+        </w:rPr>
         <mc:AlternateContent>
           <mc:Choice Requires="wps">
             <w:drawing>
@@ -1175,6 +1650,9 @@
         </mc:AlternateContent>
       </w:r>
       <w:r>
+        <w:rPr>
+          <w:noProof/>
+        </w:rPr>
         <w:drawing>
           <wp:anchor distT="0" distB="0" distL="114300" distR="114300" simplePos="0" relativeHeight="251662336" behindDoc="0" locked="0" layoutInCell="1" allowOverlap="1" wp14:anchorId="710ABB22" wp14:editId="19539A6A">
             <wp:simplePos x="0" y="0"/>
@@ -1228,6 +1706,9 @@
     </w:p>
     <w:p>
       <w:r>
+        <w:rPr>
+          <w:noProof/>
+        </w:rPr>
         <mc:AlternateContent>
           <mc:Choice Requires="wps">
             <w:drawing>
@@ -1361,6 +1842,9 @@
         </mc:AlternateContent>
       </w:r>
       <w:r>
+        <w:rPr>
+          <w:noProof/>
+        </w:rPr>
         <w:drawing>
           <wp:anchor distT="0" distB="0" distL="114300" distR="114300" simplePos="0" relativeHeight="251663360" behindDoc="0" locked="0" layoutInCell="1" allowOverlap="1" wp14:anchorId="4BE81D16" wp14:editId="3142662C">
             <wp:simplePos x="0" y="0"/>
@@ -1417,14 +1901,18 @@
       <w:pPr>
         <w:pStyle w:val="Heading2"/>
       </w:pPr>
-      <w:bookmarkStart w:id="3" w:name="_Toc211254878"/>
-      <w:r>
+      <w:bookmarkStart w:id="3" w:name="_Toc211420108"/>
+      <w:r>
+        <w:lastRenderedPageBreak/>
         <w:t>Tests</w:t>
       </w:r>
       <w:bookmarkEnd w:id="3"/>
     </w:p>
     <w:p>
       <w:r>
+        <w:rPr>
+          <w:noProof/>
+        </w:rPr>
         <mc:AlternateContent>
           <mc:Choice Requires="wps">
             <w:drawing>
@@ -1558,6 +2046,9 @@
         </mc:AlternateContent>
       </w:r>
       <w:r>
+        <w:rPr>
+          <w:noProof/>
+        </w:rPr>
         <w:drawing>
           <wp:anchor distT="0" distB="0" distL="114300" distR="114300" simplePos="0" relativeHeight="251668480" behindDoc="0" locked="0" layoutInCell="1" allowOverlap="1" wp14:anchorId="34AFF6D2" wp14:editId="1386DEF2">
             <wp:simplePos x="0" y="0"/>
@@ -1613,9 +2104,8 @@
       <w:pPr>
         <w:pStyle w:val="Heading1"/>
       </w:pPr>
-      <w:bookmarkStart w:id="4" w:name="_Toc211254879"/>
-      <w:r>
-        <w:lastRenderedPageBreak/>
+      <w:bookmarkStart w:id="4" w:name="_Toc211420109"/>
+      <w:r>
         <w:t>Exercise 2</w:t>
       </w:r>
       <w:r>
@@ -1627,18 +2117,32 @@
       <w:pPr>
         <w:pStyle w:val="Heading2"/>
       </w:pPr>
-      <w:bookmarkStart w:id="5" w:name="_Toc211254880"/>
+      <w:bookmarkStart w:id="5" w:name="_Toc211420110"/>
       <w:r>
         <w:t>Solution Idea</w:t>
       </w:r>
       <w:bookmarkEnd w:id="5"/>
     </w:p>
+    <w:p>
+      <w:r>
+        <w:t>The task is to perform all simple arithmetic operations and display them.</w:t>
+      </w:r>
+      <w:r>
+        <w:t xml:space="preserve"> The result of each operation should be saved in their own variable. </w:t>
+      </w:r>
+      <w:r>
+        <w:t xml:space="preserve">Since the task specifies that the input should be two integers, there’s needs to be a cast to a float during the division process, to display the correct result. </w:t>
+      </w:r>
+    </w:p>
+    <w:bookmarkStart w:id="6" w:name="_Toc211420111"/>
     <w:p>
       <w:pPr>
         <w:pStyle w:val="Heading2"/>
       </w:pPr>
-      <w:bookmarkStart w:id="6" w:name="_Toc211254881"/>
-      <w:r>
+      <w:r>
+        <w:rPr>
+          <w:noProof/>
+        </w:rPr>
         <mc:AlternateContent>
           <mc:Choice Requires="wps">
             <w:drawing>
@@ -1778,6 +2282,9 @@
         </mc:AlternateContent>
       </w:r>
       <w:r>
+        <w:rPr>
+          <w:noProof/>
+        </w:rPr>
         <w:drawing>
           <wp:anchor distT="0" distB="0" distL="114300" distR="114300" simplePos="0" relativeHeight="251671552" behindDoc="0" locked="0" layoutInCell="1" allowOverlap="1" wp14:anchorId="5A0E0DFE" wp14:editId="26115C0E">
             <wp:simplePos x="0" y="0"/>
@@ -1835,6 +2342,9 @@
     </w:p>
     <w:p>
       <w:r>
+        <w:rPr>
+          <w:noProof/>
+        </w:rPr>
         <mc:AlternateContent>
           <mc:Choice Requires="wps">
             <w:drawing>
@@ -1968,6 +2478,9 @@
         </mc:AlternateContent>
       </w:r>
       <w:r>
+        <w:rPr>
+          <w:noProof/>
+        </w:rPr>
         <w:drawing>
           <wp:anchor distT="0" distB="0" distL="114300" distR="114300" simplePos="0" relativeHeight="251674624" behindDoc="0" locked="0" layoutInCell="1" allowOverlap="1" wp14:anchorId="516A4843" wp14:editId="4C46C8CF">
             <wp:simplePos x="0" y="0"/>
@@ -2024,7 +2537,7 @@
       <w:pPr>
         <w:pStyle w:val="Heading2"/>
       </w:pPr>
-      <w:bookmarkStart w:id="7" w:name="_Toc211254882"/>
+      <w:bookmarkStart w:id="7" w:name="_Toc211420112"/>
       <w:r>
         <w:t>Tests</w:t>
       </w:r>
@@ -2032,6 +2545,9 @@
     </w:p>
     <w:p>
       <w:r>
+        <w:rPr>
+          <w:noProof/>
+        </w:rPr>
         <mc:AlternateContent>
           <mc:Choice Requires="wps">
             <w:drawing>
@@ -2149,6 +2665,9 @@
         </mc:AlternateContent>
       </w:r>
       <w:r>
+        <w:rPr>
+          <w:noProof/>
+        </w:rPr>
         <w:drawing>
           <wp:anchor distT="0" distB="0" distL="114300" distR="114300" simplePos="0" relativeHeight="251678720" behindDoc="0" locked="0" layoutInCell="1" allowOverlap="1" wp14:anchorId="69380766" wp14:editId="037A6F35">
             <wp:simplePos x="0" y="0"/>
@@ -2201,12 +2720,15 @@
       </w:r>
     </w:p>
     <w:p/>
+    <w:bookmarkStart w:id="8" w:name="_Toc211420113"/>
     <w:p>
       <w:pPr>
         <w:pStyle w:val="Heading1"/>
       </w:pPr>
-      <w:bookmarkStart w:id="8" w:name="_Toc211254883"/>
-      <w:r>
+      <w:r>
+        <w:rPr>
+          <w:noProof/>
+        </w:rPr>
         <mc:AlternateContent>
           <mc:Choice Requires="wps">
             <w:drawing>
@@ -2330,6 +2852,9 @@
         </mc:AlternateContent>
       </w:r>
       <w:r>
+        <w:rPr>
+          <w:noProof/>
+        </w:rPr>
         <w:drawing>
           <wp:anchor distT="0" distB="0" distL="114300" distR="114300" simplePos="0" relativeHeight="251680768" behindDoc="0" locked="0" layoutInCell="1" allowOverlap="1" wp14:anchorId="434E8C81" wp14:editId="153459F0">
             <wp:simplePos x="0" y="0"/>
@@ -2393,9 +2918,11 @@
       <w:pPr>
         <w:pStyle w:val="Heading2"/>
       </w:pPr>
+      <w:bookmarkStart w:id="9" w:name="_Toc211420114"/>
       <w:r>
         <w:t>Pseudocode</w:t>
       </w:r>
+      <w:bookmarkEnd w:id="9"/>
     </w:p>
     <w:p/>
     <w:p>
@@ -2655,6 +3182,7 @@
         <w:rPr>
           <w:lang w:val="en-US"/>
         </w:rPr>
+        <w:lastRenderedPageBreak/>
         <w:t>10</w:t>
       </w:r>
       <w:r>
@@ -2817,10 +3345,12 @@
       <w:pPr>
         <w:pStyle w:val="Heading2"/>
       </w:pPr>
+      <w:bookmarkStart w:id="10" w:name="_Toc211420115"/>
       <w:r>
         <w:lastRenderedPageBreak/>
         <w:t>Trace Table</w:t>
       </w:r>
+      <w:bookmarkEnd w:id="10"/>
     </w:p>
     <w:tbl>
       <w:tblPr>
@@ -3914,7 +4444,6 @@
           <w:szCs w:val="40"/>
         </w:rPr>
       </w:pPr>
-      <w:bookmarkStart w:id="9" w:name="_Toc211254884"/>
       <w:r>
         <w:br w:type="page"/>
       </w:r>
@@ -3923,6 +4452,7 @@
       <w:pPr>
         <w:pStyle w:val="Heading1"/>
       </w:pPr>
+      <w:bookmarkStart w:id="11" w:name="_Toc211420116"/>
       <w:r>
         <w:lastRenderedPageBreak/>
         <w:t>Exercise 4</w:t>
@@ -3930,15 +4460,17 @@
       <w:r>
         <w:t xml:space="preserve"> – Number Guessing</w:t>
       </w:r>
-      <w:bookmarkEnd w:id="9"/>
+      <w:bookmarkEnd w:id="11"/>
     </w:p>
     <w:p>
       <w:pPr>
         <w:pStyle w:val="Heading2"/>
       </w:pPr>
+      <w:bookmarkStart w:id="12" w:name="_Toc211420117"/>
       <w:r>
         <w:t>Pseudocode</w:t>
       </w:r>
+      <w:bookmarkEnd w:id="12"/>
     </w:p>
     <w:p>
       <w:pPr>
@@ -4602,7 +5134,19 @@
           <w:lang w:val="en-US"/>
         </w:rPr>
         <w:tab/>
-        <w:t xml:space="preserve">PRINT “Correct! You guess it in </w:t>
+        <w:t>PRINT “Correct! You guess</w:t>
+      </w:r>
+      <w:r>
+        <w:rPr>
+          <w:lang w:val="en-US"/>
+        </w:rPr>
+        <w:t>ed</w:t>
+      </w:r>
+      <w:r>
+        <w:rPr>
+          <w:lang w:val="en-US"/>
+        </w:rPr>
+        <w:t xml:space="preserve"> it in </w:t>
       </w:r>
       <w:proofErr w:type="gramStart"/>
       <w:r>
@@ -4715,9 +5259,32 @@
       <w:pPr>
         <w:pStyle w:val="Heading2"/>
       </w:pPr>
+      <w:bookmarkStart w:id="13" w:name="_Toc211420118"/>
       <w:r>
         <w:lastRenderedPageBreak/>
         <w:t>Trace Table</w:t>
+      </w:r>
+      <w:bookmarkEnd w:id="13"/>
+    </w:p>
+    <w:p>
+      <w:pPr>
+        <w:rPr>
+          <w:i/>
+          <w:iCs/>
+          <w:color w:val="808080" w:themeColor="background1" w:themeShade="80"/>
+          <w:sz w:val="18"/>
+          <w:szCs w:val="18"/>
+        </w:rPr>
+      </w:pPr>
+      <w:r>
+        <w:rPr>
+          <w:i/>
+          <w:iCs/>
+          <w:color w:val="808080" w:themeColor="background1" w:themeShade="80"/>
+          <w:sz w:val="18"/>
+          <w:szCs w:val="18"/>
+        </w:rPr>
+        <w:t>For brevity reasons, most print statements have been skipped.</w:t>
       </w:r>
     </w:p>
     <w:tbl>
@@ -5933,23 +6500,6 @@
                 <w:szCs w:val="16"/>
                 <w:lang w:val="en-US"/>
               </w:rPr>
-              <w:t>12</w:t>
-            </w:r>
-            <w:r>
-              <w:rPr>
-                <w:sz w:val="16"/>
-                <w:szCs w:val="16"/>
-                <w:lang w:val="en-US"/>
-              </w:rPr>
-              <w:tab/>
-            </w:r>
-            <w:r>
-              <w:rPr>
-                <w:sz w:val="16"/>
-                <w:szCs w:val="16"/>
-                <w:lang w:val="en-US"/>
-              </w:rPr>
-              <w:tab/>
               <w:t xml:space="preserve">IF </w:t>
             </w:r>
             <w:proofErr w:type="spellStart"/>
@@ -7261,6 +7811,7 @@
                 <w:sz w:val="16"/>
                 <w:szCs w:val="16"/>
               </w:rPr>
+              <w:lastRenderedPageBreak/>
               <w:t>25</w:t>
             </w:r>
           </w:p>
@@ -7385,7 +7936,6 @@
                 <w:sz w:val="16"/>
                 <w:szCs w:val="16"/>
               </w:rPr>
-              <w:lastRenderedPageBreak/>
               <w:t>10</w:t>
             </w:r>
           </w:p>

</xml_diff>